<commit_message>
Update 2026.09.14 CV document
</commit_message>
<xml_diff>
--- a/CV_Osnadchuk_V_O.docx
+++ b/CV_Osnadchuk_V_O.docx
@@ -1986,21 +1986,6 @@
     </w:p>
     <w:p>
       <w:pPr>
-        <w:spacing w:after="20" w:before="40" w:lineRule="auto"/>
-        <w:rPr>
-          <w:color w:val="555566"/>
-          <w:sz w:val="21"/>
-          <w:szCs w:val="21"/>
-        </w:rPr>
-      </w:pPr>
-      <w:r>
-        <w:rPr>
-          <w:rtl w:val="0"/>
-        </w:rPr>
-      </w:r>
-    </w:p>
-    <w:p>
-      <w:pPr>
         <w:pBdr>
           <w:bottom w:color="ccd6f0" w:space="1" w:sz="4" w:val="single"/>
         </w:pBdr>
@@ -2020,18 +2005,179 @@
       <w:pPr>
         <w:spacing w:after="60" w:before="120" w:lineRule="auto"/>
         <w:rPr>
-          <w:sz w:val="22"/>
-          <w:szCs w:val="22"/>
-        </w:rPr>
-      </w:pPr>
-      <w:r>
-        <w:rPr>
-          <w:rFonts w:ascii="Calibri" w:cs="Calibri" w:eastAsia="Calibri" w:hAnsi="Calibri"/>
           <w:b w:val="1"/>
           <w:bCs w:val="1"/>
           <w:color w:val="1a73e8"/>
           <w:sz w:val="22"/>
           <w:szCs w:val="22"/>
+        </w:rPr>
+      </w:pPr>
+      <w:r>
+        <w:rPr>
+          <w:rtl w:val="0"/>
+        </w:rPr>
+      </w:r>
+    </w:p>
+    <w:p>
+      <w:pPr>
+        <w:pStyle w:val="Heading2"/>
+        <w:keepNext w:val="0"/>
+        <w:keepLines w:val="0"/>
+        <w:pBdr>
+          <w:top w:color="auto" w:space="0" w:sz="0" w:val="none"/>
+          <w:left w:color="auto" w:space="0" w:sz="0" w:val="none"/>
+          <w:bottom w:color="auto" w:space="0" w:sz="0" w:val="none"/>
+          <w:right w:color="auto" w:space="0" w:sz="0" w:val="none"/>
+          <w:between w:color="auto" w:space="0" w:sz="0" w:val="none"/>
+        </w:pBdr>
+        <w:shd w:fill="ffffff" w:val="clear"/>
+        <w:spacing w:before="0" w:line="300" w:lineRule="auto"/>
+        <w:rPr>
+          <w:b w:val="1"/>
+          <w:bCs w:val="1"/>
+          <w:color w:val="1a73e8"/>
+          <w:sz w:val="22"/>
+          <w:szCs w:val="22"/>
+        </w:rPr>
+      </w:pPr>
+      <w:bookmarkStart w:colFirst="0" w:colLast="0" w:name="_222xbef08tc3" w:id="0"/>
+      <w:bookmarkEnd w:id="0"/>
+      <w:r>
+        <w:rPr>
+          <w:color w:val="1a73e8"/>
+          <w:sz w:val="22"/>
+          <w:szCs w:val="22"/>
+          <w:rtl w:val="0"/>
+        </w:rPr>
+        <w:t xml:space="preserve">SERTIFICATIONS</w:t>
+      </w:r>
+      <w:r>
+        <w:rPr>
+          <w:rtl w:val="0"/>
+        </w:rPr>
+      </w:r>
+    </w:p>
+    <w:p>
+      <w:pPr>
+        <w:spacing w:after="40" w:before="40" w:lineRule="auto"/>
+        <w:rPr>
+          <w:rFonts w:ascii="Calibri" w:cs="Calibri" w:eastAsia="Calibri" w:hAnsi="Calibri"/>
+          <w:color w:val="555566"/>
+        </w:rPr>
+      </w:pPr>
+      <w:r>
+        <w:rPr>
+          <w:b w:val="1"/>
+          <w:bCs w:val="1"/>
+          <w:color w:val="1a1a2e"/>
+          <w:sz w:val="21"/>
+          <w:szCs w:val="21"/>
+          <w:rtl w:val="0"/>
+        </w:rPr>
+        <w:t xml:space="preserve">Next.js Fundamentals, v4 Course Completed </w:t>
+      </w:r>
+      <w:r>
+        <w:rPr>
+          <w:color w:val="555566"/>
+          <w:sz w:val="21"/>
+          <w:szCs w:val="21"/>
+          <w:rtl w:val="0"/>
+        </w:rPr>
+        <w:t xml:space="preserve">—</w:t>
+      </w:r>
+      <w:r>
+        <w:rPr>
+          <w:b w:val="1"/>
+          <w:bCs w:val="1"/>
+          <w:color w:val="1a1a2e"/>
+          <w:sz w:val="21"/>
+          <w:szCs w:val="21"/>
+          <w:rtl w:val="0"/>
+        </w:rPr>
+        <w:t xml:space="preserve"> </w:t>
+      </w:r>
+      <w:r>
+        <w:rPr>
+          <w:color w:val="555566"/>
+          <w:rtl w:val="0"/>
+        </w:rPr>
+        <w:t xml:space="preserve">Issued Sep 2026 </w:t>
+      </w:r>
+      <w:r>
+        <w:rPr>
+          <w:b w:val="1"/>
+          <w:bCs w:val="1"/>
+          <w:color w:val="1a1a2e"/>
+          <w:sz w:val="21"/>
+          <w:szCs w:val="21"/>
+          <w:rtl w:val="0"/>
+        </w:rPr>
+        <w:br w:type="textWrapping"/>
+      </w:r>
+      <w:r>
+        <w:rPr>
+          <w:color w:val="1a1a2e"/>
+          <w:sz w:val="21"/>
+          <w:szCs w:val="21"/>
+          <w:rtl w:val="0"/>
+        </w:rPr>
+        <w:t xml:space="preserve">Master.dev (Formerly Frontend Masters)</w:t>
+      </w:r>
+      <w:r>
+        <w:rPr>
+          <w:rtl w:val="0"/>
+        </w:rPr>
+      </w:r>
+    </w:p>
+    <w:p>
+      <w:pPr>
+        <w:pBdr>
+          <w:bottom w:color="ccd6f0" w:space="1" w:sz="4" w:val="single"/>
+        </w:pBdr>
+        <w:spacing w:after="80" w:before="40" w:lineRule="auto"/>
+        <w:rPr>
+          <w:sz w:val="22"/>
+          <w:szCs w:val="22"/>
+        </w:rPr>
+      </w:pPr>
+      <w:r>
+        <w:rPr>
+          <w:rtl w:val="0"/>
+        </w:rPr>
+      </w:r>
+    </w:p>
+    <w:p>
+      <w:pPr>
+        <w:spacing w:after="60" w:before="120" w:lineRule="auto"/>
+        <w:rPr>
+          <w:b w:val="1"/>
+          <w:bCs w:val="1"/>
+          <w:color w:val="1a73e8"/>
+          <w:sz w:val="22"/>
+          <w:szCs w:val="22"/>
+        </w:rPr>
+      </w:pPr>
+      <w:r>
+        <w:rPr>
+          <w:rtl w:val="0"/>
+        </w:rPr>
+      </w:r>
+    </w:p>
+    <w:p>
+      <w:pPr>
+        <w:spacing w:after="60" w:before="120" w:lineRule="auto"/>
+        <w:rPr>
+          <w:sz w:val="22"/>
+          <w:szCs w:val="22"/>
+        </w:rPr>
+      </w:pPr>
+      <w:r>
+        <w:rPr>
+          <w:b w:val="1"/>
+          <w:bCs w:val="1"/>
+          <w:color w:val="1a73e8"/>
+          <w:sz w:val="22"/>
+          <w:szCs w:val="22"/>
           <w:rtl w:val="0"/>
         </w:rPr>
         <w:t xml:space="preserve">LANGUAGES &amp; EDUCATION</w:t>
@@ -2052,7 +2198,6 @@
       </w:pPr>
       <w:r>
         <w:rPr>
-          <w:rFonts w:ascii="Calibri" w:cs="Calibri" w:eastAsia="Calibri" w:hAnsi="Calibri"/>
           <w:b w:val="1"/>
           <w:bCs w:val="1"/>
           <w:sz w:val="21"/>
@@ -2063,7 +2208,6 @@
       </w:r>
       <w:r>
         <w:rPr>
-          <w:rFonts w:ascii="Calibri" w:cs="Calibri" w:eastAsia="Calibri" w:hAnsi="Calibri"/>
           <w:color w:val="555566"/>
           <w:sz w:val="21"/>
           <w:szCs w:val="21"/>
@@ -2073,7 +2217,6 @@
       </w:r>
       <w:r>
         <w:rPr>
-          <w:rFonts w:ascii="Calibri" w:cs="Calibri" w:eastAsia="Calibri" w:hAnsi="Calibri"/>
           <w:b w:val="1"/>
           <w:bCs w:val="1"/>
           <w:sz w:val="21"/>
@@ -2084,7 +2227,6 @@
       </w:r>
       <w:r>
         <w:rPr>
-          <w:rFonts w:ascii="Calibri" w:cs="Calibri" w:eastAsia="Calibri" w:hAnsi="Calibri"/>
           <w:color w:val="555566"/>
           <w:sz w:val="21"/>
           <w:szCs w:val="21"/>
@@ -2108,7 +2250,6 @@
       </w:pPr>
       <w:r>
         <w:rPr>
-          <w:rFonts w:ascii="Calibri" w:cs="Calibri" w:eastAsia="Calibri" w:hAnsi="Calibri"/>
           <w:b w:val="1"/>
           <w:bCs w:val="1"/>
           <w:color w:val="1a1a2e"/>
@@ -2126,20 +2267,32 @@
     </w:p>
     <w:p>
       <w:pPr>
+        <w:spacing w:after="0" w:lineRule="auto"/>
+        <w:rPr>
+          <w:sz w:val="22"/>
+          <w:szCs w:val="22"/>
+        </w:rPr>
+      </w:pPr>
+      <w:r>
+        <w:rPr>
+          <w:color w:val="555566"/>
+          <w:rtl w:val="0"/>
+        </w:rPr>
+        <w:t xml:space="preserve">National University of Food Technologies, Kyiv · 2011–2012</w:t>
+      </w:r>
+      <w:r>
+        <w:rPr>
+          <w:rtl w:val="0"/>
+        </w:rPr>
+      </w:r>
+    </w:p>
+    <w:p>
+      <w:pPr>
         <w:spacing w:after="0" w:before="0" w:lineRule="auto"/>
         <w:rPr>
-          <w:sz w:val="22"/>
-          <w:szCs w:val="22"/>
-        </w:rPr>
-      </w:pPr>
-      <w:r>
-        <w:rPr>
-          <w:rFonts w:ascii="Calibri" w:cs="Calibri" w:eastAsia="Calibri" w:hAnsi="Calibri"/>
           <w:color w:val="555566"/>
-          <w:rtl w:val="0"/>
-        </w:rPr>
-        <w:t xml:space="preserve">National University of Food Technologies, Kyiv · 2011–2012</w:t>
-      </w:r>
+        </w:rPr>
+      </w:pPr>
       <w:r>
         <w:rPr>
           <w:rtl w:val="0"/>

</xml_diff>

<commit_message>
Update 2026.09.15 CV document
</commit_message>
<xml_diff>
--- a/CV_Osnadchuk_V_O.docx
+++ b/CV_Osnadchuk_V_O.docx
@@ -320,6 +320,52 @@
     </w:p>
     <w:p>
       <w:pPr>
+        <w:rPr/>
+      </w:pPr>
+      <w:r>
+        <w:rPr>
+          <w:color w:val="1a1a2e"/>
+          <w:sz w:val="21"/>
+          <w:szCs w:val="21"/>
+          <w:rtl w:val="0"/>
+        </w:rPr>
+        <w:t xml:space="preserve">Frontend Developer with 10+ years across FinTech, Betting, and Enterprise SaaS. Last 4 years on CreditFlow — a financial analytics platform for US Debt Capital Markets with 150+ institutional clients. Before that: high-traffic sports betting (Favbet), cross-platform apps (React Native, Angular), and enterprise web platforms with REST API integrations. Specialises in TypeScript/React, real-time data (WebSocket), complex forms, legacy migrations, and automated testing (Playwright, Jest, Vitest, GitHub Actions CI). End-to-end feature ownership; regular business demos; SAFe Agile.</w:t>
+      </w:r>
+      <w:r>
+        <w:rPr>
+          <w:rtl w:val="0"/>
+        </w:rPr>
+      </w:r>
+    </w:p>
+    <w:p>
+      <w:pPr>
+        <w:spacing w:after="60" w:before="120" w:lineRule="auto"/>
+        <w:rPr>
+          <w:sz w:val="22"/>
+          <w:szCs w:val="22"/>
+        </w:rPr>
+      </w:pPr>
+      <w:r>
+        <w:rPr>
+          <w:rFonts w:ascii="Calibri" w:cs="Calibri" w:eastAsia="Calibri" w:hAnsi="Calibri"/>
+          <w:b w:val="1"/>
+          <w:bCs w:val="1"/>
+          <w:color w:val="1a73e8"/>
+          <w:sz w:val="22"/>
+          <w:szCs w:val="22"/>
+          <w:rtl w:val="0"/>
+        </w:rPr>
+        <w:t xml:space="preserve">EXPERIENCE</w:t>
+      </w:r>
+      <w:r>
+        <w:rPr>
+          <w:rtl w:val="0"/>
+        </w:rPr>
+      </w:r>
+    </w:p>
+    <w:p>
+      <w:pPr>
+        <w:spacing w:after="20" w:before="100" w:lineRule="auto"/>
         <w:rPr>
           <w:sz w:val="22"/>
           <w:szCs w:val="22"/>
@@ -334,77 +380,11 @@
           <w:szCs w:val="23"/>
           <w:rtl w:val="0"/>
         </w:rPr>
-        <w:t xml:space="preserve">Senior Frontend Developer</w:t>
-      </w:r>
-      <w:r>
-        <w:rPr>
-          <w:sz w:val="22"/>
-          <w:szCs w:val="22"/>
-          <w:rtl w:val="0"/>
-        </w:rPr>
-        <w:t xml:space="preserve"> </w:t>
-      </w:r>
-      <w:r>
-        <w:rPr>
-          <w:color w:val="1a1a2e"/>
-          <w:sz w:val="21"/>
-          <w:szCs w:val="21"/>
-          <w:rtl w:val="0"/>
-        </w:rPr>
-        <w:t xml:space="preserve">with 10+ years of experience building high-performance, data-driven web applications in Fintech, E-learning, and High-Traffic domains. Expert in designing complex financial dashboards, data-entry systems, and scalable product architectures aligned with business growth goals. Skilled in optimizing platforms under heavy loads and establishing robust automation testing to guarantee flawless release stability. </w:t>
-      </w:r>
-      <w:r>
-        <w:rPr>
-          <w:rtl w:val="0"/>
-        </w:rPr>
-      </w:r>
-    </w:p>
-    <w:p>
-      <w:pPr>
-        <w:rPr/>
-      </w:pPr>
-      <w:r>
-        <w:rPr>
-          <w:rtl w:val="0"/>
-        </w:rPr>
-      </w:r>
-    </w:p>
-    <w:p>
-      <w:pPr>
-        <w:spacing w:after="60" w:before="120" w:lineRule="auto"/>
-        <w:rPr>
-          <w:sz w:val="22"/>
-          <w:szCs w:val="22"/>
-        </w:rPr>
-      </w:pPr>
-      <w:r>
-        <w:rPr>
-          <w:rFonts w:ascii="Calibri" w:cs="Calibri" w:eastAsia="Calibri" w:hAnsi="Calibri"/>
-          <w:b w:val="1"/>
-          <w:bCs w:val="1"/>
-          <w:color w:val="1a73e8"/>
-          <w:sz w:val="22"/>
-          <w:szCs w:val="22"/>
-          <w:rtl w:val="0"/>
-        </w:rPr>
-        <w:t xml:space="preserve">EXPERIENCE</w:t>
-      </w:r>
-      <w:r>
-        <w:rPr>
-          <w:rtl w:val="0"/>
-        </w:rPr>
-      </w:r>
-    </w:p>
-    <w:p>
-      <w:pPr>
-        <w:spacing w:after="20" w:before="100" w:lineRule="auto"/>
-        <w:rPr>
-          <w:sz w:val="22"/>
-          <w:szCs w:val="22"/>
-        </w:rPr>
-      </w:pPr>
-      <w:r>
-        <w:rPr>
+        <w:t xml:space="preserve">Senior </w:t>
+      </w:r>
+      <w:r>
+        <w:rPr>
+          <w:rFonts w:ascii="Calibri" w:cs="Calibri" w:eastAsia="Calibri" w:hAnsi="Calibri"/>
           <w:b w:val="1"/>
           <w:bCs w:val="1"/>
           <w:color w:val="1a1a2e"/>
@@ -412,18 +392,6 @@
           <w:szCs w:val="23"/>
           <w:rtl w:val="0"/>
         </w:rPr>
-        <w:t xml:space="preserve">Senior </w:t>
-      </w:r>
-      <w:r>
-        <w:rPr>
-          <w:rFonts w:ascii="Calibri" w:cs="Calibri" w:eastAsia="Calibri" w:hAnsi="Calibri"/>
-          <w:b w:val="1"/>
-          <w:bCs w:val="1"/>
-          <w:color w:val="1a1a2e"/>
-          <w:sz w:val="23"/>
-          <w:szCs w:val="23"/>
-          <w:rtl w:val="0"/>
-        </w:rPr>
         <w:t xml:space="preserve">Frontend Developer  ·  Finsight — Kyiv</w:t>
       </w:r>
       <w:r>
@@ -436,8 +404,9 @@
       <w:pPr>
         <w:spacing w:after="40" w:before="0" w:lineRule="auto"/>
         <w:rPr>
-          <w:sz w:val="22"/>
-          <w:szCs w:val="22"/>
+          <w:color w:val="1a1a2e"/>
+          <w:sz w:val="21"/>
+          <w:szCs w:val="21"/>
         </w:rPr>
       </w:pPr>
       <w:r>
@@ -454,6 +423,60 @@
         <w:rPr>
           <w:rtl w:val="0"/>
         </w:rPr>
+      </w:r>
+    </w:p>
+    <w:p>
+      <w:pPr>
+        <w:keepNext w:val="0"/>
+        <w:keepLines w:val="0"/>
+        <w:pageBreakBefore w:val="0"/>
+        <w:widowControl w:val="1"/>
+        <w:numPr>
+          <w:ilvl w:val="0"/>
+          <w:numId w:val="1"/>
+        </w:numPr>
+        <w:pBdr>
+          <w:top w:space="0" w:sz="0" w:val="nil"/>
+          <w:left w:space="0" w:sz="0" w:val="nil"/>
+          <w:bottom w:space="0" w:sz="0" w:val="nil"/>
+          <w:right w:space="0" w:sz="0" w:val="nil"/>
+          <w:between w:space="0" w:sz="0" w:val="nil"/>
+        </w:pBdr>
+        <w:shd w:fill="auto" w:val="clear"/>
+        <w:spacing w:after="20" w:before="0" w:line="276" w:lineRule="auto"/>
+        <w:ind w:left="283" w:right="0" w:hanging="360"/>
+        <w:jc w:val="left"/>
+        <w:rPr>
+          <w:sz w:val="22"/>
+          <w:szCs w:val="22"/>
+        </w:rPr>
+      </w:pPr>
+      <w:r>
+        <w:rPr>
+          <w:color w:val="1a1a2e"/>
+          <w:sz w:val="21"/>
+          <w:szCs w:val="21"/>
+          <w:rtl w:val="0"/>
+        </w:rPr>
+        <w:t xml:space="preserve">Built real-time data tables with SSR rendering and WebSocket subscriptions for a </w:t>
+      </w:r>
+      <w:r>
+        <w:rPr>
+          <w:color w:val="1a1a2e"/>
+          <w:sz w:val="21"/>
+          <w:szCs w:val="21"/>
+          <w:rtl w:val="0"/>
+        </w:rPr>
+        <w:t xml:space="preserve">financial data and analytics platform used by institutional investors and investment banks</w:t>
+      </w:r>
+      <w:r>
+        <w:rPr>
+          <w:color w:val="1a1a2e"/>
+          <w:sz w:val="21"/>
+          <w:szCs w:val="21"/>
+          <w:rtl w:val="0"/>
+        </w:rPr>
+        <w:t xml:space="preserve">.</w:t>
       </w:r>
     </w:p>
     <w:p>
@@ -484,6 +507,277 @@
       </w:pPr>
       <w:r>
         <w:rPr>
+          <w:color w:val="1a1a2e"/>
+          <w:sz w:val="21"/>
+          <w:szCs w:val="21"/>
+          <w:rtl w:val="0"/>
+        </w:rPr>
+        <w:t xml:space="preserve">Engineered key user-facing analytical features for the CreditFlow platform: Bond Screener, League Tables, Portfolio Monitor, New Issue Volume charts, interactive dashboards.</w:t>
+      </w:r>
+    </w:p>
+    <w:p>
+      <w:pPr>
+        <w:keepNext w:val="0"/>
+        <w:keepLines w:val="0"/>
+        <w:pageBreakBefore w:val="0"/>
+        <w:widowControl w:val="1"/>
+        <w:numPr>
+          <w:ilvl w:val="0"/>
+          <w:numId w:val="1"/>
+        </w:numPr>
+        <w:pBdr>
+          <w:top w:space="0" w:sz="0" w:val="nil"/>
+          <w:left w:space="0" w:sz="0" w:val="nil"/>
+          <w:bottom w:space="0" w:sz="0" w:val="nil"/>
+          <w:right w:space="0" w:sz="0" w:val="nil"/>
+          <w:between w:space="0" w:sz="0" w:val="nil"/>
+        </w:pBdr>
+        <w:shd w:fill="auto" w:val="clear"/>
+        <w:spacing w:after="0" w:before="20" w:line="276" w:lineRule="auto"/>
+        <w:ind w:left="283" w:right="0" w:hanging="360"/>
+        <w:jc w:val="left"/>
+        <w:rPr>
+          <w:sz w:val="22"/>
+          <w:szCs w:val="22"/>
+        </w:rPr>
+      </w:pPr>
+      <w:r>
+        <w:rPr>
+          <w:color w:val="1a1a2e"/>
+          <w:sz w:val="21"/>
+          <w:szCs w:val="21"/>
+          <w:rtl w:val="0"/>
+        </w:rPr>
+        <w:t xml:space="preserve">Drove three platform-wide migrations: JavaScript → TypeScript, Redux Form → Final Form, Redux → React Context.</w:t>
+      </w:r>
+    </w:p>
+    <w:p>
+      <w:pPr>
+        <w:keepNext w:val="0"/>
+        <w:keepLines w:val="0"/>
+        <w:pageBreakBefore w:val="0"/>
+        <w:widowControl w:val="1"/>
+        <w:numPr>
+          <w:ilvl w:val="0"/>
+          <w:numId w:val="1"/>
+        </w:numPr>
+        <w:pBdr>
+          <w:top w:space="0" w:sz="0" w:val="nil"/>
+          <w:left w:space="0" w:sz="0" w:val="nil"/>
+          <w:bottom w:space="0" w:sz="0" w:val="nil"/>
+          <w:right w:space="0" w:sz="0" w:val="nil"/>
+          <w:between w:space="0" w:sz="0" w:val="nil"/>
+        </w:pBdr>
+        <w:shd w:fill="auto" w:val="clear"/>
+        <w:spacing w:after="0" w:before="20" w:line="276" w:lineRule="auto"/>
+        <w:ind w:left="283" w:right="0" w:hanging="360"/>
+        <w:jc w:val="left"/>
+        <w:rPr>
+          <w:sz w:val="22"/>
+          <w:szCs w:val="22"/>
+        </w:rPr>
+      </w:pPr>
+      <w:r>
+        <w:rPr>
+          <w:color w:val="1a1a2e"/>
+          <w:sz w:val="21"/>
+          <w:szCs w:val="21"/>
+          <w:rtl w:val="0"/>
+        </w:rPr>
+        <w:t xml:space="preserve">Built Playwright E2E tests + Jest/Vitest unit tests integrated into GitHub Actions CI.</w:t>
+      </w:r>
+    </w:p>
+    <w:p>
+      <w:pPr>
+        <w:keepNext w:val="0"/>
+        <w:keepLines w:val="0"/>
+        <w:pageBreakBefore w:val="0"/>
+        <w:widowControl w:val="1"/>
+        <w:numPr>
+          <w:ilvl w:val="0"/>
+          <w:numId w:val="1"/>
+        </w:numPr>
+        <w:pBdr>
+          <w:top w:space="0" w:sz="0" w:val="nil"/>
+          <w:left w:space="0" w:sz="0" w:val="nil"/>
+          <w:bottom w:space="0" w:sz="0" w:val="nil"/>
+          <w:right w:space="0" w:sz="0" w:val="nil"/>
+          <w:between w:space="0" w:sz="0" w:val="nil"/>
+        </w:pBdr>
+        <w:shd w:fill="auto" w:val="clear"/>
+        <w:spacing w:after="0" w:before="20" w:line="276" w:lineRule="auto"/>
+        <w:ind w:left="283" w:right="0" w:hanging="360"/>
+        <w:jc w:val="left"/>
+        <w:rPr>
+          <w:sz w:val="22"/>
+          <w:szCs w:val="22"/>
+        </w:rPr>
+      </w:pPr>
+      <w:r>
+        <w:rPr>
+          <w:color w:val="1a1a2e"/>
+          <w:sz w:val="21"/>
+          <w:szCs w:val="21"/>
+          <w:rtl w:val="0"/>
+        </w:rPr>
+        <w:t xml:space="preserve">Performed mandatory code reviews within a 10-person squad; owned features from spec to production.</w:t>
+      </w:r>
+    </w:p>
+    <w:p>
+      <w:pPr>
+        <w:keepNext w:val="0"/>
+        <w:keepLines w:val="0"/>
+        <w:pageBreakBefore w:val="0"/>
+        <w:widowControl w:val="1"/>
+        <w:numPr>
+          <w:ilvl w:val="0"/>
+          <w:numId w:val="1"/>
+        </w:numPr>
+        <w:pBdr>
+          <w:top w:space="0" w:sz="0" w:val="nil"/>
+          <w:left w:space="0" w:sz="0" w:val="nil"/>
+          <w:bottom w:space="0" w:sz="0" w:val="nil"/>
+          <w:right w:space="0" w:sz="0" w:val="nil"/>
+          <w:between w:space="0" w:sz="0" w:val="nil"/>
+        </w:pBdr>
+        <w:shd w:fill="auto" w:val="clear"/>
+        <w:spacing w:after="0" w:before="20" w:line="276" w:lineRule="auto"/>
+        <w:ind w:left="283" w:right="0" w:hanging="360"/>
+        <w:jc w:val="left"/>
+        <w:rPr>
+          <w:sz w:val="22"/>
+          <w:szCs w:val="22"/>
+        </w:rPr>
+      </w:pPr>
+      <w:r>
+        <w:rPr>
+          <w:color w:val="1a1a2e"/>
+          <w:sz w:val="21"/>
+          <w:szCs w:val="21"/>
+          <w:rtl w:val="0"/>
+        </w:rPr>
+        <w:t xml:space="preserve">Presented sprint deliverables to business stakeholders 3+ times per PI; monitored Sentry errors daily.</w:t>
+      </w:r>
+    </w:p>
+    <w:p>
+      <w:pPr>
+        <w:keepNext w:val="0"/>
+        <w:keepLines w:val="0"/>
+        <w:pageBreakBefore w:val="0"/>
+        <w:widowControl w:val="1"/>
+        <w:numPr>
+          <w:ilvl w:val="0"/>
+          <w:numId w:val="1"/>
+        </w:numPr>
+        <w:pBdr>
+          <w:top w:space="0" w:sz="0" w:val="nil"/>
+          <w:left w:space="0" w:sz="0" w:val="nil"/>
+          <w:bottom w:space="0" w:sz="0" w:val="nil"/>
+          <w:right w:space="0" w:sz="0" w:val="nil"/>
+          <w:between w:space="0" w:sz="0" w:val="nil"/>
+        </w:pBdr>
+        <w:shd w:fill="auto" w:val="clear"/>
+        <w:spacing w:after="0" w:before="20" w:line="276" w:lineRule="auto"/>
+        <w:ind w:left="283" w:right="0" w:hanging="360"/>
+        <w:jc w:val="left"/>
+        <w:rPr>
+          <w:sz w:val="22"/>
+          <w:szCs w:val="22"/>
+        </w:rPr>
+      </w:pPr>
+      <w:r>
+        <w:rPr>
+          <w:color w:val="1a1a2e"/>
+          <w:sz w:val="21"/>
+          <w:szCs w:val="21"/>
+          <w:rtl w:val="0"/>
+        </w:rPr>
+        <w:t xml:space="preserve">Worked in SAFe Agile (2-week sprints, PI planning, backlog refinement, retros).</w:t>
+      </w:r>
+      <w:r>
+        <w:rPr>
+          <w:rtl w:val="0"/>
+        </w:rPr>
+      </w:r>
+    </w:p>
+    <w:p>
+      <w:pPr>
+        <w:spacing w:after="20" w:before="100" w:lineRule="auto"/>
+        <w:rPr>
+          <w:sz w:val="22"/>
+          <w:szCs w:val="22"/>
+        </w:rPr>
+      </w:pPr>
+      <w:r>
+        <w:rPr>
+          <w:rFonts w:ascii="Calibri" w:cs="Calibri" w:eastAsia="Calibri" w:hAnsi="Calibri"/>
+          <w:b w:val="1"/>
+          <w:bCs w:val="1"/>
+          <w:color w:val="1a1a2e"/>
+          <w:sz w:val="23"/>
+          <w:szCs w:val="23"/>
+          <w:rtl w:val="0"/>
+        </w:rPr>
+        <w:t xml:space="preserve">Frontend Developer  ·  Betinvest — Kyiv</w:t>
+      </w:r>
+      <w:r>
+        <w:rPr>
+          <w:rtl w:val="0"/>
+        </w:rPr>
+      </w:r>
+    </w:p>
+    <w:p>
+      <w:pPr>
+        <w:spacing w:after="40" w:before="0" w:lineRule="auto"/>
+        <w:rPr>
+          <w:sz w:val="22"/>
+          <w:szCs w:val="22"/>
+        </w:rPr>
+      </w:pPr>
+      <w:r>
+        <w:rPr>
+          <w:rFonts w:ascii="Calibri" w:cs="Calibri" w:eastAsia="Calibri" w:hAnsi="Calibri"/>
+          <w:i w:val="1"/>
+          <w:iCs w:val="1"/>
+          <w:color w:val="555566"/>
+          <w:rtl w:val="0"/>
+        </w:rPr>
+        <w:t xml:space="preserve">February 2020 – February 2022</w:t>
+      </w:r>
+      <w:r>
+        <w:rPr>
+          <w:rtl w:val="0"/>
+        </w:rPr>
+      </w:r>
+    </w:p>
+    <w:p>
+      <w:pPr>
+        <w:keepNext w:val="0"/>
+        <w:keepLines w:val="0"/>
+        <w:pageBreakBefore w:val="0"/>
+        <w:widowControl w:val="1"/>
+        <w:numPr>
+          <w:ilvl w:val="0"/>
+          <w:numId w:val="1"/>
+        </w:numPr>
+        <w:pBdr>
+          <w:top w:space="0" w:sz="0" w:val="nil"/>
+          <w:left w:space="0" w:sz="0" w:val="nil"/>
+          <w:bottom w:space="0" w:sz="0" w:val="nil"/>
+          <w:right w:space="0" w:sz="0" w:val="nil"/>
+          <w:between w:space="0" w:sz="0" w:val="nil"/>
+        </w:pBdr>
+        <w:shd w:fill="auto" w:val="clear"/>
+        <w:spacing w:after="0" w:before="20" w:line="276" w:lineRule="auto"/>
+        <w:ind w:left="283" w:right="0" w:hanging="360"/>
+        <w:jc w:val="left"/>
+        <w:rPr>
+          <w:sz w:val="22"/>
+          <w:szCs w:val="22"/>
+        </w:rPr>
+      </w:pPr>
+      <w:r>
+        <w:rPr>
           <w:rFonts w:ascii="Calibri" w:cs="Calibri" w:eastAsia="Calibri" w:hAnsi="Calibri"/>
           <w:b w:val="0"/>
           <w:bCs w:val="0"/>
@@ -499,7 +793,816 @@
           <w:vertAlign w:val="baseline"/>
           <w:rtl w:val="0"/>
         </w:rPr>
-        <w:t xml:space="preserve">Engineered key user-facing analytical features for the CreditFlow platform: Bond Screener, League Tables, Portfolio Monitor, dynamic charts (New Issue Volume), and interactive dashboards.</w:t>
+        <w:t xml:space="preserve">Developed new features and maintained core React applications for a high-traffic sports betting platform (Favbet).</w:t>
+      </w:r>
+      <w:r>
+        <w:rPr>
+          <w:rtl w:val="0"/>
+        </w:rPr>
+      </w:r>
+    </w:p>
+    <w:p>
+      <w:pPr>
+        <w:keepNext w:val="0"/>
+        <w:keepLines w:val="0"/>
+        <w:pageBreakBefore w:val="0"/>
+        <w:widowControl w:val="1"/>
+        <w:numPr>
+          <w:ilvl w:val="0"/>
+          <w:numId w:val="1"/>
+        </w:numPr>
+        <w:pBdr>
+          <w:top w:space="0" w:sz="0" w:val="nil"/>
+          <w:left w:space="0" w:sz="0" w:val="nil"/>
+          <w:bottom w:space="0" w:sz="0" w:val="nil"/>
+          <w:right w:space="0" w:sz="0" w:val="nil"/>
+          <w:between w:space="0" w:sz="0" w:val="nil"/>
+        </w:pBdr>
+        <w:shd w:fill="auto" w:val="clear"/>
+        <w:spacing w:after="20" w:before="0" w:line="276" w:lineRule="auto"/>
+        <w:ind w:left="283" w:right="0" w:hanging="360"/>
+        <w:jc w:val="left"/>
+        <w:rPr>
+          <w:sz w:val="22"/>
+          <w:szCs w:val="22"/>
+        </w:rPr>
+      </w:pPr>
+      <w:r>
+        <w:rPr>
+          <w:rFonts w:ascii="Calibri" w:cs="Calibri" w:eastAsia="Calibri" w:hAnsi="Calibri"/>
+          <w:b w:val="0"/>
+          <w:bCs w:val="0"/>
+          <w:i w:val="0"/>
+          <w:iCs w:val="0"/>
+          <w:smallCaps w:val="0"/>
+          <w:strike w:val="0"/>
+          <w:color w:val="1a1a2e"/>
+          <w:sz w:val="21"/>
+          <w:szCs w:val="21"/>
+          <w:u w:val="none"/>
+          <w:shd w:fill="auto" w:val="clear"/>
+          <w:vertAlign w:val="baseline"/>
+          <w:rtl w:val="0"/>
+        </w:rPr>
+        <w:t xml:space="preserve">Implemented state-driven components, custom React Hooks, React Hook Form, design system libraries.</w:t>
+      </w:r>
+      <w:r>
+        <w:rPr>
+          <w:rtl w:val="0"/>
+        </w:rPr>
+      </w:r>
+    </w:p>
+    <w:p>
+      <w:pPr>
+        <w:spacing w:after="20" w:before="100" w:lineRule="auto"/>
+        <w:rPr>
+          <w:sz w:val="22"/>
+          <w:szCs w:val="22"/>
+        </w:rPr>
+      </w:pPr>
+      <w:r>
+        <w:rPr>
+          <w:b w:val="1"/>
+          <w:bCs w:val="1"/>
+          <w:color w:val="1a1a2e"/>
+          <w:sz w:val="23"/>
+          <w:szCs w:val="23"/>
+          <w:rtl w:val="0"/>
+        </w:rPr>
+        <w:t xml:space="preserve">Frontend Developer</w:t>
+      </w:r>
+      <w:r>
+        <w:rPr>
+          <w:rFonts w:ascii="Calibri" w:cs="Calibri" w:eastAsia="Calibri" w:hAnsi="Calibri"/>
+          <w:b w:val="1"/>
+          <w:bCs w:val="1"/>
+          <w:color w:val="1a1a2e"/>
+          <w:sz w:val="23"/>
+          <w:szCs w:val="23"/>
+          <w:rtl w:val="0"/>
+        </w:rPr>
+        <w:t xml:space="preserve"> ·  Softwarium — Kyiv</w:t>
+      </w:r>
+      <w:r>
+        <w:rPr>
+          <w:rtl w:val="0"/>
+        </w:rPr>
+      </w:r>
+    </w:p>
+    <w:p>
+      <w:pPr>
+        <w:spacing w:after="40" w:before="0" w:lineRule="auto"/>
+        <w:rPr>
+          <w:sz w:val="22"/>
+          <w:szCs w:val="22"/>
+        </w:rPr>
+      </w:pPr>
+      <w:r>
+        <w:rPr>
+          <w:rFonts w:ascii="Calibri" w:cs="Calibri" w:eastAsia="Calibri" w:hAnsi="Calibri"/>
+          <w:i w:val="1"/>
+          <w:iCs w:val="1"/>
+          <w:color w:val="555566"/>
+          <w:rtl w:val="0"/>
+        </w:rPr>
+        <w:t xml:space="preserve">April 2019 – February 2020</w:t>
+      </w:r>
+      <w:r>
+        <w:rPr>
+          <w:rtl w:val="0"/>
+        </w:rPr>
+      </w:r>
+    </w:p>
+    <w:p>
+      <w:pPr>
+        <w:keepNext w:val="0"/>
+        <w:keepLines w:val="0"/>
+        <w:pageBreakBefore w:val="0"/>
+        <w:widowControl w:val="1"/>
+        <w:numPr>
+          <w:ilvl w:val="0"/>
+          <w:numId w:val="1"/>
+        </w:numPr>
+        <w:pBdr>
+          <w:top w:space="0" w:sz="0" w:val="nil"/>
+          <w:left w:space="0" w:sz="0" w:val="nil"/>
+          <w:bottom w:space="0" w:sz="0" w:val="nil"/>
+          <w:right w:space="0" w:sz="0" w:val="nil"/>
+          <w:between w:space="0" w:sz="0" w:val="nil"/>
+        </w:pBdr>
+        <w:shd w:fill="auto" w:val="clear"/>
+        <w:spacing w:after="0" w:before="20" w:line="276" w:lineRule="auto"/>
+        <w:ind w:left="283" w:right="0" w:hanging="360"/>
+        <w:jc w:val="left"/>
+        <w:rPr>
+          <w:sz w:val="22"/>
+          <w:szCs w:val="22"/>
+        </w:rPr>
+      </w:pPr>
+      <w:r>
+        <w:rPr>
+          <w:rFonts w:ascii="Calibri" w:cs="Calibri" w:eastAsia="Calibri" w:hAnsi="Calibri"/>
+          <w:b w:val="0"/>
+          <w:bCs w:val="0"/>
+          <w:i w:val="0"/>
+          <w:iCs w:val="0"/>
+          <w:smallCaps w:val="0"/>
+          <w:strike w:val="0"/>
+          <w:color w:val="1a1a2e"/>
+          <w:sz w:val="21"/>
+          <w:szCs w:val="21"/>
+          <w:u w:val="none"/>
+          <w:shd w:fill="auto" w:val="clear"/>
+          <w:vertAlign w:val="baseline"/>
+          <w:rtl w:val="0"/>
+        </w:rPr>
+        <w:t xml:space="preserve">Built interactive React applications for childcare and school facility management (Vigilo).</w:t>
+      </w:r>
+      <w:r>
+        <w:rPr>
+          <w:rtl w:val="0"/>
+        </w:rPr>
+      </w:r>
+    </w:p>
+    <w:p>
+      <w:pPr>
+        <w:keepNext w:val="0"/>
+        <w:keepLines w:val="0"/>
+        <w:pageBreakBefore w:val="0"/>
+        <w:widowControl w:val="1"/>
+        <w:numPr>
+          <w:ilvl w:val="0"/>
+          <w:numId w:val="1"/>
+        </w:numPr>
+        <w:pBdr>
+          <w:top w:space="0" w:sz="0" w:val="nil"/>
+          <w:left w:space="0" w:sz="0" w:val="nil"/>
+          <w:bottom w:space="0" w:sz="0" w:val="nil"/>
+          <w:right w:space="0" w:sz="0" w:val="nil"/>
+          <w:between w:space="0" w:sz="0" w:val="nil"/>
+        </w:pBdr>
+        <w:shd w:fill="auto" w:val="clear"/>
+        <w:spacing w:after="20" w:before="0" w:line="276" w:lineRule="auto"/>
+        <w:ind w:left="283" w:right="0" w:hanging="360"/>
+        <w:jc w:val="left"/>
+        <w:rPr>
+          <w:sz w:val="22"/>
+          <w:szCs w:val="22"/>
+        </w:rPr>
+      </w:pPr>
+      <w:r>
+        <w:rPr>
+          <w:rFonts w:ascii="Calibri" w:cs="Calibri" w:eastAsia="Calibri" w:hAnsi="Calibri"/>
+          <w:b w:val="0"/>
+          <w:bCs w:val="0"/>
+          <w:i w:val="0"/>
+          <w:iCs w:val="0"/>
+          <w:smallCaps w:val="0"/>
+          <w:strike w:val="0"/>
+          <w:color w:val="1a1a2e"/>
+          <w:sz w:val="21"/>
+          <w:szCs w:val="21"/>
+          <w:u w:val="none"/>
+          <w:shd w:fill="auto" w:val="clear"/>
+          <w:vertAlign w:val="baseline"/>
+          <w:rtl w:val="0"/>
+        </w:rPr>
+        <w:t xml:space="preserve">Used Redux, Formik, React-intl for localization.</w:t>
+      </w:r>
+      <w:r>
+        <w:rPr>
+          <w:rtl w:val="0"/>
+        </w:rPr>
+      </w:r>
+    </w:p>
+    <w:p>
+      <w:pPr>
+        <w:spacing w:after="20" w:before="100" w:lineRule="auto"/>
+        <w:rPr>
+          <w:sz w:val="22"/>
+          <w:szCs w:val="22"/>
+        </w:rPr>
+      </w:pPr>
+      <w:r>
+        <w:rPr>
+          <w:b w:val="1"/>
+          <w:bCs w:val="1"/>
+          <w:color w:val="1a1a2e"/>
+          <w:sz w:val="23"/>
+          <w:szCs w:val="23"/>
+          <w:rtl w:val="0"/>
+        </w:rPr>
+        <w:t xml:space="preserve">Junior Frontend Developer </w:t>
+      </w:r>
+      <w:r>
+        <w:rPr>
+          <w:rFonts w:ascii="Calibri" w:cs="Calibri" w:eastAsia="Calibri" w:hAnsi="Calibri"/>
+          <w:b w:val="1"/>
+          <w:bCs w:val="1"/>
+          <w:color w:val="1a1a2e"/>
+          <w:sz w:val="23"/>
+          <w:szCs w:val="23"/>
+          <w:rtl w:val="0"/>
+        </w:rPr>
+        <w:t xml:space="preserve"> ·  OldminTeam — Zhytomyr</w:t>
+      </w:r>
+      <w:r>
+        <w:rPr>
+          <w:rtl w:val="0"/>
+        </w:rPr>
+      </w:r>
+    </w:p>
+    <w:p>
+      <w:pPr>
+        <w:spacing w:after="40" w:before="0" w:lineRule="auto"/>
+        <w:rPr>
+          <w:sz w:val="22"/>
+          <w:szCs w:val="22"/>
+        </w:rPr>
+      </w:pPr>
+      <w:r>
+        <w:rPr>
+          <w:rFonts w:ascii="Calibri" w:cs="Calibri" w:eastAsia="Calibri" w:hAnsi="Calibri"/>
+          <w:i w:val="1"/>
+          <w:iCs w:val="1"/>
+          <w:color w:val="555566"/>
+          <w:rtl w:val="0"/>
+        </w:rPr>
+        <w:t xml:space="preserve">May 2018 – April 2019</w:t>
+      </w:r>
+      <w:r>
+        <w:rPr>
+          <w:rtl w:val="0"/>
+        </w:rPr>
+      </w:r>
+    </w:p>
+    <w:p>
+      <w:pPr>
+        <w:keepNext w:val="0"/>
+        <w:keepLines w:val="0"/>
+        <w:pageBreakBefore w:val="0"/>
+        <w:widowControl w:val="1"/>
+        <w:numPr>
+          <w:ilvl w:val="0"/>
+          <w:numId w:val="1"/>
+        </w:numPr>
+        <w:pBdr>
+          <w:top w:space="0" w:sz="0" w:val="nil"/>
+          <w:left w:space="0" w:sz="0" w:val="nil"/>
+          <w:bottom w:space="0" w:sz="0" w:val="nil"/>
+          <w:right w:space="0" w:sz="0" w:val="nil"/>
+          <w:between w:space="0" w:sz="0" w:val="nil"/>
+        </w:pBdr>
+        <w:shd w:fill="auto" w:val="clear"/>
+        <w:spacing w:after="20" w:before="20" w:line="276" w:lineRule="auto"/>
+        <w:ind w:left="283" w:right="0" w:hanging="360"/>
+        <w:jc w:val="left"/>
+        <w:rPr>
+          <w:sz w:val="22"/>
+          <w:szCs w:val="22"/>
+        </w:rPr>
+      </w:pPr>
+      <w:r>
+        <w:rPr>
+          <w:rFonts w:ascii="Calibri" w:cs="Calibri" w:eastAsia="Calibri" w:hAnsi="Calibri"/>
+          <w:b w:val="0"/>
+          <w:bCs w:val="0"/>
+          <w:i w:val="0"/>
+          <w:iCs w:val="0"/>
+          <w:smallCaps w:val="0"/>
+          <w:strike w:val="0"/>
+          <w:color w:val="1a1a2e"/>
+          <w:sz w:val="21"/>
+          <w:szCs w:val="21"/>
+          <w:u w:val="none"/>
+          <w:shd w:fill="auto" w:val="clear"/>
+          <w:vertAlign w:val="baseline"/>
+          <w:rtl w:val="0"/>
+        </w:rPr>
+        <w:t xml:space="preserve">Cross-platform web and mobile applications with Angular 2+, React.js, React Native.</w:t>
+      </w:r>
+      <w:r>
+        <w:rPr>
+          <w:rtl w:val="0"/>
+        </w:rPr>
+      </w:r>
+    </w:p>
+    <w:p>
+      <w:pPr>
+        <w:spacing w:after="20" w:before="100" w:lineRule="auto"/>
+        <w:rPr>
+          <w:sz w:val="22"/>
+          <w:szCs w:val="22"/>
+        </w:rPr>
+      </w:pPr>
+      <w:r>
+        <w:rPr>
+          <w:b w:val="1"/>
+          <w:bCs w:val="1"/>
+          <w:color w:val="1a1a2e"/>
+          <w:sz w:val="23"/>
+          <w:szCs w:val="23"/>
+          <w:rtl w:val="0"/>
+        </w:rPr>
+        <w:t xml:space="preserve">Junior Frontend</w:t>
+      </w:r>
+      <w:r>
+        <w:rPr>
+          <w:rFonts w:ascii="Calibri" w:cs="Calibri" w:eastAsia="Calibri" w:hAnsi="Calibri"/>
+          <w:b w:val="1"/>
+          <w:bCs w:val="1"/>
+          <w:color w:val="1a1a2e"/>
+          <w:sz w:val="23"/>
+          <w:szCs w:val="23"/>
+          <w:rtl w:val="0"/>
+        </w:rPr>
+        <w:t xml:space="preserve"> Developer  ·  JBS Ukraine — Zhytomyr</w:t>
+      </w:r>
+      <w:r>
+        <w:rPr>
+          <w:rtl w:val="0"/>
+        </w:rPr>
+      </w:r>
+    </w:p>
+    <w:p>
+      <w:pPr>
+        <w:spacing w:after="40" w:before="0" w:lineRule="auto"/>
+        <w:rPr>
+          <w:sz w:val="22"/>
+          <w:szCs w:val="22"/>
+        </w:rPr>
+      </w:pPr>
+      <w:r>
+        <w:rPr>
+          <w:rFonts w:ascii="Calibri" w:cs="Calibri" w:eastAsia="Calibri" w:hAnsi="Calibri"/>
+          <w:i w:val="1"/>
+          <w:iCs w:val="1"/>
+          <w:color w:val="555566"/>
+          <w:rtl w:val="0"/>
+        </w:rPr>
+        <w:t xml:space="preserve">May 2016 – May 2018</w:t>
+      </w:r>
+      <w:r>
+        <w:rPr>
+          <w:rtl w:val="0"/>
+        </w:rPr>
+      </w:r>
+    </w:p>
+    <w:p>
+      <w:pPr>
+        <w:keepNext w:val="0"/>
+        <w:keepLines w:val="0"/>
+        <w:pageBreakBefore w:val="0"/>
+        <w:widowControl w:val="1"/>
+        <w:numPr>
+          <w:ilvl w:val="0"/>
+          <w:numId w:val="1"/>
+        </w:numPr>
+        <w:pBdr>
+          <w:top w:space="0" w:sz="0" w:val="nil"/>
+          <w:left w:space="0" w:sz="0" w:val="nil"/>
+          <w:bottom w:space="0" w:sz="0" w:val="nil"/>
+          <w:right w:space="0" w:sz="0" w:val="nil"/>
+          <w:between w:space="0" w:sz="0" w:val="nil"/>
+        </w:pBdr>
+        <w:shd w:fill="auto" w:val="clear"/>
+        <w:spacing w:after="20" w:before="20" w:line="276" w:lineRule="auto"/>
+        <w:ind w:left="283" w:right="0" w:hanging="360"/>
+        <w:jc w:val="left"/>
+        <w:rPr>
+          <w:sz w:val="22"/>
+          <w:szCs w:val="22"/>
+        </w:rPr>
+      </w:pPr>
+      <w:r>
+        <w:rPr>
+          <w:rFonts w:ascii="Calibri" w:cs="Calibri" w:eastAsia="Calibri" w:hAnsi="Calibri"/>
+          <w:b w:val="0"/>
+          <w:bCs w:val="0"/>
+          <w:i w:val="0"/>
+          <w:iCs w:val="0"/>
+          <w:smallCaps w:val="0"/>
+          <w:strike w:val="0"/>
+          <w:color w:val="1a1a2e"/>
+          <w:sz w:val="21"/>
+          <w:szCs w:val="21"/>
+          <w:u w:val="none"/>
+          <w:shd w:fill="auto" w:val="clear"/>
+          <w:vertAlign w:val="baseline"/>
+          <w:rtl w:val="0"/>
+        </w:rPr>
+        <w:t xml:space="preserve">Responsive layouts, corporate web platforms, third-party REST API integrations.</w:t>
+      </w:r>
+      <w:r>
+        <w:rPr>
+          <w:rtl w:val="0"/>
+        </w:rPr>
+      </w:r>
+    </w:p>
+    <w:p>
+      <w:pPr>
+        <w:spacing w:after="60" w:before="120" w:lineRule="auto"/>
+        <w:rPr>
+          <w:sz w:val="22"/>
+          <w:szCs w:val="22"/>
+        </w:rPr>
+      </w:pPr>
+      <w:r>
+        <w:rPr>
+          <w:rFonts w:ascii="Calibri" w:cs="Calibri" w:eastAsia="Calibri" w:hAnsi="Calibri"/>
+          <w:b w:val="1"/>
+          <w:bCs w:val="1"/>
+          <w:color w:val="1a73e8"/>
+          <w:sz w:val="22"/>
+          <w:szCs w:val="22"/>
+          <w:rtl w:val="0"/>
+        </w:rPr>
+        <w:t xml:space="preserve">TECHNICAL SKILLS</w:t>
+      </w:r>
+      <w:r>
+        <w:rPr>
+          <w:rtl w:val="0"/>
+        </w:rPr>
+      </w:r>
+    </w:p>
+    <w:p>
+      <w:pPr>
+        <w:spacing w:after="40" w:before="40" w:lineRule="auto"/>
+        <w:rPr>
+          <w:sz w:val="22"/>
+          <w:szCs w:val="22"/>
+        </w:rPr>
+      </w:pPr>
+      <w:r>
+        <w:rPr>
+          <w:rFonts w:ascii="Calibri" w:cs="Calibri" w:eastAsia="Calibri" w:hAnsi="Calibri"/>
+          <w:b w:val="1"/>
+          <w:bCs w:val="1"/>
+          <w:color w:val="1a1a2e"/>
+          <w:sz w:val="21"/>
+          <w:szCs w:val="21"/>
+          <w:rtl w:val="0"/>
+        </w:rPr>
+        <w:t xml:space="preserve">Languages: </w:t>
+      </w:r>
+      <w:r>
+        <w:rPr>
+          <w:rFonts w:ascii="Calibri" w:cs="Calibri" w:eastAsia="Calibri" w:hAnsi="Calibri"/>
+          <w:color w:val="555566"/>
+          <w:sz w:val="21"/>
+          <w:szCs w:val="21"/>
+          <w:rtl w:val="0"/>
+        </w:rPr>
+        <w:t xml:space="preserve">JavaScript (ES6+), TypeScript, HTML5, CSS3</w:t>
+      </w:r>
+      <w:r>
+        <w:rPr>
+          <w:rtl w:val="0"/>
+        </w:rPr>
+      </w:r>
+    </w:p>
+    <w:p>
+      <w:pPr>
+        <w:spacing w:after="40" w:before="40" w:lineRule="auto"/>
+        <w:rPr>
+          <w:sz w:val="22"/>
+          <w:szCs w:val="22"/>
+        </w:rPr>
+      </w:pPr>
+      <w:r>
+        <w:rPr>
+          <w:rFonts w:ascii="Calibri" w:cs="Calibri" w:eastAsia="Calibri" w:hAnsi="Calibri"/>
+          <w:b w:val="1"/>
+          <w:bCs w:val="1"/>
+          <w:color w:val="1a1a2e"/>
+          <w:sz w:val="21"/>
+          <w:szCs w:val="21"/>
+          <w:rtl w:val="0"/>
+        </w:rPr>
+        <w:t xml:space="preserve">Frameworks &amp; Libs: </w:t>
+      </w:r>
+      <w:r>
+        <w:rPr>
+          <w:rFonts w:ascii="Calibri" w:cs="Calibri" w:eastAsia="Calibri" w:hAnsi="Calibri"/>
+          <w:color w:val="555566"/>
+          <w:sz w:val="21"/>
+          <w:szCs w:val="21"/>
+          <w:rtl w:val="0"/>
+        </w:rPr>
+        <w:t xml:space="preserve">React, Next.js, Angular (2+), React Native, Redux, React Context</w:t>
+      </w:r>
+      <w:r>
+        <w:rPr>
+          <w:rtl w:val="0"/>
+        </w:rPr>
+      </w:r>
+    </w:p>
+    <w:p>
+      <w:pPr>
+        <w:spacing w:after="40" w:before="40" w:lineRule="auto"/>
+        <w:rPr>
+          <w:sz w:val="22"/>
+          <w:szCs w:val="22"/>
+        </w:rPr>
+      </w:pPr>
+      <w:r>
+        <w:rPr>
+          <w:rFonts w:ascii="Calibri" w:cs="Calibri" w:eastAsia="Calibri" w:hAnsi="Calibri"/>
+          <w:b w:val="1"/>
+          <w:bCs w:val="1"/>
+          <w:color w:val="1a1a2e"/>
+          <w:sz w:val="21"/>
+          <w:szCs w:val="21"/>
+          <w:rtl w:val="0"/>
+        </w:rPr>
+        <w:t xml:space="preserve">Forms &amp; Validation: </w:t>
+      </w:r>
+      <w:r>
+        <w:rPr>
+          <w:rFonts w:ascii="Calibri" w:cs="Calibri" w:eastAsia="Calibri" w:hAnsi="Calibri"/>
+          <w:color w:val="555566"/>
+          <w:sz w:val="21"/>
+          <w:szCs w:val="21"/>
+          <w:rtl w:val="0"/>
+        </w:rPr>
+        <w:t xml:space="preserve">Final Form, React Hook Form, Formik, Redux Form, </w:t>
+      </w:r>
+      <w:r>
+        <w:rPr>
+          <w:color w:val="555566"/>
+          <w:sz w:val="21"/>
+          <w:szCs w:val="21"/>
+          <w:rtl w:val="0"/>
+        </w:rPr>
+        <w:t xml:space="preserve">TanStack Query</w:t>
+      </w:r>
+      <w:r>
+        <w:rPr>
+          <w:rtl w:val="0"/>
+        </w:rPr>
+      </w:r>
+    </w:p>
+    <w:p>
+      <w:pPr>
+        <w:spacing w:after="40" w:before="40" w:lineRule="auto"/>
+        <w:rPr>
+          <w:sz w:val="22"/>
+          <w:szCs w:val="22"/>
+        </w:rPr>
+      </w:pPr>
+      <w:r>
+        <w:rPr>
+          <w:rFonts w:ascii="Calibri" w:cs="Calibri" w:eastAsia="Calibri" w:hAnsi="Calibri"/>
+          <w:b w:val="1"/>
+          <w:bCs w:val="1"/>
+          <w:color w:val="1a1a2e"/>
+          <w:sz w:val="21"/>
+          <w:szCs w:val="21"/>
+          <w:rtl w:val="0"/>
+        </w:rPr>
+        <w:t xml:space="preserve">Styling &amp; UI: </w:t>
+      </w:r>
+      <w:r>
+        <w:rPr>
+          <w:rFonts w:ascii="Calibri" w:cs="Calibri" w:eastAsia="Calibri" w:hAnsi="Calibri"/>
+          <w:color w:val="555566"/>
+          <w:sz w:val="21"/>
+          <w:szCs w:val="21"/>
+          <w:rtl w:val="0"/>
+        </w:rPr>
+        <w:t xml:space="preserve">Sass, Styled Components, CSS Modules, UIKit, Material UI, Design Systems, </w:t>
+      </w:r>
+      <w:r>
+        <w:rPr>
+          <w:color w:val="555566"/>
+          <w:sz w:val="21"/>
+          <w:szCs w:val="21"/>
+          <w:rtl w:val="0"/>
+        </w:rPr>
+        <w:t xml:space="preserve">Tailwind</w:t>
+      </w:r>
+      <w:r>
+        <w:rPr>
+          <w:rFonts w:ascii="Calibri" w:cs="Calibri" w:eastAsia="Calibri" w:hAnsi="Calibri"/>
+          <w:color w:val="555566"/>
+          <w:sz w:val="21"/>
+          <w:szCs w:val="21"/>
+          <w:rtl w:val="0"/>
+        </w:rPr>
+        <w:t xml:space="preserve"> CSS</w:t>
+      </w:r>
+      <w:r>
+        <w:rPr>
+          <w:rtl w:val="0"/>
+        </w:rPr>
+      </w:r>
+    </w:p>
+    <w:p>
+      <w:pPr>
+        <w:spacing w:after="40" w:before="40" w:lineRule="auto"/>
+        <w:rPr>
+          <w:sz w:val="22"/>
+          <w:szCs w:val="22"/>
+        </w:rPr>
+      </w:pPr>
+      <w:r>
+        <w:rPr>
+          <w:rFonts w:ascii="Calibri" w:cs="Calibri" w:eastAsia="Calibri" w:hAnsi="Calibri"/>
+          <w:b w:val="1"/>
+          <w:bCs w:val="1"/>
+          <w:color w:val="1a1a2e"/>
+          <w:sz w:val="21"/>
+          <w:szCs w:val="21"/>
+          <w:rtl w:val="0"/>
+        </w:rPr>
+        <w:t xml:space="preserve">Testing: </w:t>
+      </w:r>
+      <w:r>
+        <w:rPr>
+          <w:rFonts w:ascii="Calibri" w:cs="Calibri" w:eastAsia="Calibri" w:hAnsi="Calibri"/>
+          <w:color w:val="555566"/>
+          <w:sz w:val="21"/>
+          <w:szCs w:val="21"/>
+          <w:rtl w:val="0"/>
+        </w:rPr>
+        <w:t xml:space="preserve">Playwright, Jest, Vitest</w:t>
+      </w:r>
+      <w:r>
+        <w:rPr>
+          <w:rtl w:val="0"/>
+        </w:rPr>
+      </w:r>
+    </w:p>
+    <w:p>
+      <w:pPr>
+        <w:spacing w:after="40" w:before="40" w:lineRule="auto"/>
+        <w:rPr>
+          <w:sz w:val="22"/>
+          <w:szCs w:val="22"/>
+        </w:rPr>
+      </w:pPr>
+      <w:r>
+        <w:rPr>
+          <w:rFonts w:ascii="Calibri" w:cs="Calibri" w:eastAsia="Calibri" w:hAnsi="Calibri"/>
+          <w:b w:val="1"/>
+          <w:bCs w:val="1"/>
+          <w:color w:val="1a1a2e"/>
+          <w:sz w:val="21"/>
+          <w:szCs w:val="21"/>
+          <w:rtl w:val="0"/>
+        </w:rPr>
+        <w:t xml:space="preserve">Tools: </w:t>
+      </w:r>
+      <w:r>
+        <w:rPr>
+          <w:rFonts w:ascii="Calibri" w:cs="Calibri" w:eastAsia="Calibri" w:hAnsi="Calibri"/>
+          <w:color w:val="555566"/>
+          <w:sz w:val="21"/>
+          <w:szCs w:val="21"/>
+          <w:rtl w:val="0"/>
+        </w:rPr>
+        <w:t xml:space="preserve">Git, Figma, Storybook, Sentry monitoring</w:t>
+      </w:r>
+      <w:r>
+        <w:rPr>
+          <w:rtl w:val="0"/>
+        </w:rPr>
+      </w:r>
+    </w:p>
+    <w:p>
+      <w:pPr>
+        <w:pBdr>
+          <w:bottom w:color="ccd6f0" w:space="1" w:sz="4" w:val="single"/>
+        </w:pBdr>
+        <w:spacing w:after="80" w:before="40" w:lineRule="auto"/>
+        <w:rPr>
+          <w:sz w:val="22"/>
+          <w:szCs w:val="22"/>
+        </w:rPr>
+      </w:pPr>
+      <w:r>
+        <w:rPr>
+          <w:rtl w:val="0"/>
+        </w:rPr>
+      </w:r>
+    </w:p>
+    <w:p>
+      <w:pPr>
+        <w:spacing w:after="60" w:before="120" w:lineRule="auto"/>
+        <w:rPr>
+          <w:b w:val="1"/>
+          <w:bCs w:val="1"/>
+          <w:color w:val="1a73e8"/>
+          <w:sz w:val="22"/>
+          <w:szCs w:val="22"/>
+        </w:rPr>
+      </w:pPr>
+      <w:r>
+        <w:rPr>
+          <w:rtl w:val="0"/>
+        </w:rPr>
+      </w:r>
+    </w:p>
+    <w:p>
+      <w:pPr>
+        <w:spacing w:after="60" w:before="120" w:lineRule="auto"/>
+        <w:rPr>
+          <w:sz w:val="22"/>
+          <w:szCs w:val="22"/>
+        </w:rPr>
+      </w:pPr>
+      <w:r>
+        <w:rPr>
+          <w:rFonts w:ascii="Calibri" w:cs="Calibri" w:eastAsia="Calibri" w:hAnsi="Calibri"/>
+          <w:b w:val="1"/>
+          <w:bCs w:val="1"/>
+          <w:color w:val="1a73e8"/>
+          <w:sz w:val="22"/>
+          <w:szCs w:val="22"/>
+          <w:rtl w:val="0"/>
+        </w:rPr>
+        <w:t xml:space="preserve">ACHIEVEMENTS</w:t>
+      </w:r>
+      <w:r>
+        <w:rPr>
+          <w:rtl w:val="0"/>
+        </w:rPr>
+      </w:r>
+    </w:p>
+    <w:p>
+      <w:pPr>
+        <w:keepNext w:val="0"/>
+        <w:keepLines w:val="0"/>
+        <w:pageBreakBefore w:val="0"/>
+        <w:widowControl w:val="1"/>
+        <w:numPr>
+          <w:ilvl w:val="0"/>
+          <w:numId w:val="1"/>
+        </w:numPr>
+        <w:pBdr>
+          <w:top w:space="0" w:sz="0" w:val="nil"/>
+          <w:left w:space="0" w:sz="0" w:val="nil"/>
+          <w:bottom w:space="0" w:sz="0" w:val="nil"/>
+          <w:right w:space="0" w:sz="0" w:val="nil"/>
+          <w:between w:space="0" w:sz="0" w:val="nil"/>
+        </w:pBdr>
+        <w:shd w:fill="auto" w:val="clear"/>
+        <w:spacing w:after="0" w:before="20" w:line="276" w:lineRule="auto"/>
+        <w:ind w:left="283" w:right="0" w:hanging="360"/>
+        <w:jc w:val="left"/>
+        <w:rPr>
+          <w:sz w:val="22"/>
+          <w:szCs w:val="22"/>
+        </w:rPr>
+      </w:pPr>
+      <w:r>
+        <w:rPr>
+          <w:color w:val="1a1a2e"/>
+          <w:sz w:val="21"/>
+          <w:szCs w:val="21"/>
+          <w:rtl w:val="0"/>
+        </w:rPr>
+        <w:t xml:space="preserve">Transformed the free functionality of the application into a multi-level subscription, which allowed the company to attract 150+ premium subscribers and increase monthly revenue from subscriptions.</w:t>
       </w:r>
       <w:r>
         <w:rPr>
@@ -550,982 +1653,7 @@
           <w:vertAlign w:val="baseline"/>
           <w:rtl w:val="0"/>
         </w:rPr>
-        <w:t xml:space="preserve">Developed robust full-scale data entry systems, complex tables, and high-performance forms within the internal admin platform for real-time market data ingestion.</w:t>
-      </w:r>
-      <w:r>
-        <w:rPr>
-          <w:rtl w:val="0"/>
-        </w:rPr>
-      </w:r>
-    </w:p>
-    <w:p>
-      <w:pPr>
-        <w:keepNext w:val="0"/>
-        <w:keepLines w:val="0"/>
-        <w:pageBreakBefore w:val="0"/>
-        <w:widowControl w:val="1"/>
-        <w:numPr>
-          <w:ilvl w:val="0"/>
-          <w:numId w:val="1"/>
-        </w:numPr>
-        <w:pBdr>
-          <w:top w:space="0" w:sz="0" w:val="nil"/>
-          <w:left w:space="0" w:sz="0" w:val="nil"/>
-          <w:bottom w:space="0" w:sz="0" w:val="nil"/>
-          <w:right w:space="0" w:sz="0" w:val="nil"/>
-          <w:between w:space="0" w:sz="0" w:val="nil"/>
-        </w:pBdr>
-        <w:shd w:fill="auto" w:val="clear"/>
-        <w:spacing w:after="20" w:before="0" w:line="276" w:lineRule="auto"/>
-        <w:ind w:left="283" w:right="0" w:hanging="360"/>
-        <w:jc w:val="left"/>
-        <w:rPr>
-          <w:sz w:val="22"/>
-          <w:szCs w:val="22"/>
-        </w:rPr>
-      </w:pPr>
-      <w:r>
-        <w:rPr>
-          <w:rFonts w:ascii="Calibri" w:cs="Calibri" w:eastAsia="Calibri" w:hAnsi="Calibri"/>
-          <w:b w:val="0"/>
-          <w:bCs w:val="0"/>
-          <w:i w:val="0"/>
-          <w:iCs w:val="0"/>
-          <w:smallCaps w:val="0"/>
-          <w:strike w:val="0"/>
-          <w:color w:val="1a1a2e"/>
-          <w:sz w:val="21"/>
-          <w:szCs w:val="21"/>
-          <w:u w:val="none"/>
-          <w:shd w:fill="auto" w:val="clear"/>
-          <w:vertAlign w:val="baseline"/>
-          <w:rtl w:val="0"/>
-        </w:rPr>
-        <w:t xml:space="preserve">Stack: React, Next.js, React Context, Final Form, UIKit, Playwright, Jest, Vitest.</w:t>
-      </w:r>
-      <w:r>
-        <w:rPr>
-          <w:rtl w:val="0"/>
-        </w:rPr>
-      </w:r>
-    </w:p>
-    <w:p>
-      <w:pPr>
-        <w:spacing w:after="20" w:before="100" w:lineRule="auto"/>
-        <w:rPr>
-          <w:sz w:val="22"/>
-          <w:szCs w:val="22"/>
-        </w:rPr>
-      </w:pPr>
-      <w:r>
-        <w:rPr>
-          <w:rFonts w:ascii="Calibri" w:cs="Calibri" w:eastAsia="Calibri" w:hAnsi="Calibri"/>
-          <w:b w:val="1"/>
-          <w:bCs w:val="1"/>
-          <w:color w:val="1a1a2e"/>
-          <w:sz w:val="23"/>
-          <w:szCs w:val="23"/>
-          <w:rtl w:val="0"/>
-        </w:rPr>
-        <w:t xml:space="preserve">Frontend Developer  ·  Betinvest — Kyiv</w:t>
-      </w:r>
-      <w:r>
-        <w:rPr>
-          <w:rtl w:val="0"/>
-        </w:rPr>
-      </w:r>
-    </w:p>
-    <w:p>
-      <w:pPr>
-        <w:spacing w:after="40" w:before="0" w:lineRule="auto"/>
-        <w:rPr>
-          <w:sz w:val="22"/>
-          <w:szCs w:val="22"/>
-        </w:rPr>
-      </w:pPr>
-      <w:r>
-        <w:rPr>
-          <w:rFonts w:ascii="Calibri" w:cs="Calibri" w:eastAsia="Calibri" w:hAnsi="Calibri"/>
-          <w:i w:val="1"/>
-          <w:iCs w:val="1"/>
-          <w:color w:val="555566"/>
-          <w:rtl w:val="0"/>
-        </w:rPr>
-        <w:t xml:space="preserve">February 2020 – February 2022</w:t>
-      </w:r>
-      <w:r>
-        <w:rPr>
-          <w:rtl w:val="0"/>
-        </w:rPr>
-      </w:r>
-    </w:p>
-    <w:p>
-      <w:pPr>
-        <w:keepNext w:val="0"/>
-        <w:keepLines w:val="0"/>
-        <w:pageBreakBefore w:val="0"/>
-        <w:widowControl w:val="1"/>
-        <w:numPr>
-          <w:ilvl w:val="0"/>
-          <w:numId w:val="1"/>
-        </w:numPr>
-        <w:pBdr>
-          <w:top w:space="0" w:sz="0" w:val="nil"/>
-          <w:left w:space="0" w:sz="0" w:val="nil"/>
-          <w:bottom w:space="0" w:sz="0" w:val="nil"/>
-          <w:right w:space="0" w:sz="0" w:val="nil"/>
-          <w:between w:space="0" w:sz="0" w:val="nil"/>
-        </w:pBdr>
-        <w:shd w:fill="auto" w:val="clear"/>
-        <w:spacing w:after="0" w:before="20" w:line="276" w:lineRule="auto"/>
-        <w:ind w:left="283" w:right="0" w:hanging="360"/>
-        <w:jc w:val="left"/>
-        <w:rPr>
-          <w:sz w:val="22"/>
-          <w:szCs w:val="22"/>
-        </w:rPr>
-      </w:pPr>
-      <w:r>
-        <w:rPr>
-          <w:rFonts w:ascii="Calibri" w:cs="Calibri" w:eastAsia="Calibri" w:hAnsi="Calibri"/>
-          <w:b w:val="0"/>
-          <w:bCs w:val="0"/>
-          <w:i w:val="0"/>
-          <w:iCs w:val="0"/>
-          <w:smallCaps w:val="0"/>
-          <w:strike w:val="0"/>
-          <w:color w:val="1a1a2e"/>
-          <w:sz w:val="21"/>
-          <w:szCs w:val="21"/>
-          <w:u w:val="none"/>
-          <w:shd w:fill="auto" w:val="clear"/>
-          <w:vertAlign w:val="baseline"/>
-          <w:rtl w:val="0"/>
-        </w:rPr>
-        <w:t xml:space="preserve">Developed new features and maintained core React applications for a high-traffic sports betting platform (Favbet).</w:t>
-      </w:r>
-      <w:r>
-        <w:rPr>
-          <w:rtl w:val="0"/>
-        </w:rPr>
-      </w:r>
-    </w:p>
-    <w:p>
-      <w:pPr>
-        <w:keepNext w:val="0"/>
-        <w:keepLines w:val="0"/>
-        <w:pageBreakBefore w:val="0"/>
-        <w:widowControl w:val="1"/>
-        <w:numPr>
-          <w:ilvl w:val="0"/>
-          <w:numId w:val="1"/>
-        </w:numPr>
-        <w:pBdr>
-          <w:top w:space="0" w:sz="0" w:val="nil"/>
-          <w:left w:space="0" w:sz="0" w:val="nil"/>
-          <w:bottom w:space="0" w:sz="0" w:val="nil"/>
-          <w:right w:space="0" w:sz="0" w:val="nil"/>
-          <w:between w:space="0" w:sz="0" w:val="nil"/>
-        </w:pBdr>
-        <w:shd w:fill="auto" w:val="clear"/>
-        <w:spacing w:after="20" w:before="0" w:line="276" w:lineRule="auto"/>
-        <w:ind w:left="283" w:right="0" w:hanging="360"/>
-        <w:jc w:val="left"/>
-        <w:rPr>
-          <w:sz w:val="22"/>
-          <w:szCs w:val="22"/>
-        </w:rPr>
-      </w:pPr>
-      <w:r>
-        <w:rPr>
-          <w:rFonts w:ascii="Calibri" w:cs="Calibri" w:eastAsia="Calibri" w:hAnsi="Calibri"/>
-          <w:b w:val="0"/>
-          <w:bCs w:val="0"/>
-          <w:i w:val="0"/>
-          <w:iCs w:val="0"/>
-          <w:smallCaps w:val="0"/>
-          <w:strike w:val="0"/>
-          <w:color w:val="1a1a2e"/>
-          <w:sz w:val="21"/>
-          <w:szCs w:val="21"/>
-          <w:u w:val="none"/>
-          <w:shd w:fill="auto" w:val="clear"/>
-          <w:vertAlign w:val="baseline"/>
-          <w:rtl w:val="0"/>
-        </w:rPr>
-        <w:t xml:space="preserve">Implemented state-driven components, custom React Hooks, React Hook Form, design system libraries.</w:t>
-      </w:r>
-      <w:r>
-        <w:rPr>
-          <w:rtl w:val="0"/>
-        </w:rPr>
-      </w:r>
-    </w:p>
-    <w:p>
-      <w:pPr>
-        <w:spacing w:after="20" w:before="100" w:lineRule="auto"/>
-        <w:rPr>
-          <w:sz w:val="22"/>
-          <w:szCs w:val="22"/>
-        </w:rPr>
-      </w:pPr>
-      <w:r>
-        <w:rPr>
-          <w:b w:val="1"/>
-          <w:bCs w:val="1"/>
-          <w:color w:val="1a1a2e"/>
-          <w:sz w:val="23"/>
-          <w:szCs w:val="23"/>
-          <w:rtl w:val="0"/>
-        </w:rPr>
-        <w:t xml:space="preserve">Frontend Developer</w:t>
-      </w:r>
-      <w:r>
-        <w:rPr>
-          <w:rFonts w:ascii="Calibri" w:cs="Calibri" w:eastAsia="Calibri" w:hAnsi="Calibri"/>
-          <w:b w:val="1"/>
-          <w:bCs w:val="1"/>
-          <w:color w:val="1a1a2e"/>
-          <w:sz w:val="23"/>
-          <w:szCs w:val="23"/>
-          <w:rtl w:val="0"/>
-        </w:rPr>
-        <w:t xml:space="preserve"> ·  Softwarium — Kyiv</w:t>
-      </w:r>
-      <w:r>
-        <w:rPr>
-          <w:rtl w:val="0"/>
-        </w:rPr>
-      </w:r>
-    </w:p>
-    <w:p>
-      <w:pPr>
-        <w:spacing w:after="40" w:before="0" w:lineRule="auto"/>
-        <w:rPr>
-          <w:sz w:val="22"/>
-          <w:szCs w:val="22"/>
-        </w:rPr>
-      </w:pPr>
-      <w:r>
-        <w:rPr>
-          <w:rFonts w:ascii="Calibri" w:cs="Calibri" w:eastAsia="Calibri" w:hAnsi="Calibri"/>
-          <w:i w:val="1"/>
-          <w:iCs w:val="1"/>
-          <w:color w:val="555566"/>
-          <w:rtl w:val="0"/>
-        </w:rPr>
-        <w:t xml:space="preserve">April 2019 – February 2020</w:t>
-      </w:r>
-      <w:r>
-        <w:rPr>
-          <w:rtl w:val="0"/>
-        </w:rPr>
-      </w:r>
-    </w:p>
-    <w:p>
-      <w:pPr>
-        <w:keepNext w:val="0"/>
-        <w:keepLines w:val="0"/>
-        <w:pageBreakBefore w:val="0"/>
-        <w:widowControl w:val="1"/>
-        <w:numPr>
-          <w:ilvl w:val="0"/>
-          <w:numId w:val="1"/>
-        </w:numPr>
-        <w:pBdr>
-          <w:top w:space="0" w:sz="0" w:val="nil"/>
-          <w:left w:space="0" w:sz="0" w:val="nil"/>
-          <w:bottom w:space="0" w:sz="0" w:val="nil"/>
-          <w:right w:space="0" w:sz="0" w:val="nil"/>
-          <w:between w:space="0" w:sz="0" w:val="nil"/>
-        </w:pBdr>
-        <w:shd w:fill="auto" w:val="clear"/>
-        <w:spacing w:after="0" w:before="20" w:line="276" w:lineRule="auto"/>
-        <w:ind w:left="283" w:right="0" w:hanging="360"/>
-        <w:jc w:val="left"/>
-        <w:rPr>
-          <w:sz w:val="22"/>
-          <w:szCs w:val="22"/>
-        </w:rPr>
-      </w:pPr>
-      <w:r>
-        <w:rPr>
-          <w:rFonts w:ascii="Calibri" w:cs="Calibri" w:eastAsia="Calibri" w:hAnsi="Calibri"/>
-          <w:b w:val="0"/>
-          <w:bCs w:val="0"/>
-          <w:i w:val="0"/>
-          <w:iCs w:val="0"/>
-          <w:smallCaps w:val="0"/>
-          <w:strike w:val="0"/>
-          <w:color w:val="1a1a2e"/>
-          <w:sz w:val="21"/>
-          <w:szCs w:val="21"/>
-          <w:u w:val="none"/>
-          <w:shd w:fill="auto" w:val="clear"/>
-          <w:vertAlign w:val="baseline"/>
-          <w:rtl w:val="0"/>
-        </w:rPr>
-        <w:t xml:space="preserve">Built interactive React applications for childcare and school facility management (Vigilo).</w:t>
-      </w:r>
-      <w:r>
-        <w:rPr>
-          <w:rtl w:val="0"/>
-        </w:rPr>
-      </w:r>
-    </w:p>
-    <w:p>
-      <w:pPr>
-        <w:keepNext w:val="0"/>
-        <w:keepLines w:val="0"/>
-        <w:pageBreakBefore w:val="0"/>
-        <w:widowControl w:val="1"/>
-        <w:numPr>
-          <w:ilvl w:val="0"/>
-          <w:numId w:val="1"/>
-        </w:numPr>
-        <w:pBdr>
-          <w:top w:space="0" w:sz="0" w:val="nil"/>
-          <w:left w:space="0" w:sz="0" w:val="nil"/>
-          <w:bottom w:space="0" w:sz="0" w:val="nil"/>
-          <w:right w:space="0" w:sz="0" w:val="nil"/>
-          <w:between w:space="0" w:sz="0" w:val="nil"/>
-        </w:pBdr>
-        <w:shd w:fill="auto" w:val="clear"/>
-        <w:spacing w:after="20" w:before="0" w:line="276" w:lineRule="auto"/>
-        <w:ind w:left="283" w:right="0" w:hanging="360"/>
-        <w:jc w:val="left"/>
-        <w:rPr>
-          <w:sz w:val="22"/>
-          <w:szCs w:val="22"/>
-        </w:rPr>
-      </w:pPr>
-      <w:r>
-        <w:rPr>
-          <w:rFonts w:ascii="Calibri" w:cs="Calibri" w:eastAsia="Calibri" w:hAnsi="Calibri"/>
-          <w:b w:val="0"/>
-          <w:bCs w:val="0"/>
-          <w:i w:val="0"/>
-          <w:iCs w:val="0"/>
-          <w:smallCaps w:val="0"/>
-          <w:strike w:val="0"/>
-          <w:color w:val="1a1a2e"/>
-          <w:sz w:val="21"/>
-          <w:szCs w:val="21"/>
-          <w:u w:val="none"/>
-          <w:shd w:fill="auto" w:val="clear"/>
-          <w:vertAlign w:val="baseline"/>
-          <w:rtl w:val="0"/>
-        </w:rPr>
-        <w:t xml:space="preserve">Used Redux, Formik, React-intl for localization.</w:t>
-      </w:r>
-      <w:r>
-        <w:rPr>
-          <w:rtl w:val="0"/>
-        </w:rPr>
-      </w:r>
-    </w:p>
-    <w:p>
-      <w:pPr>
-        <w:spacing w:after="20" w:before="100" w:lineRule="auto"/>
-        <w:rPr>
-          <w:sz w:val="22"/>
-          <w:szCs w:val="22"/>
-        </w:rPr>
-      </w:pPr>
-      <w:r>
-        <w:rPr>
-          <w:b w:val="1"/>
-          <w:bCs w:val="1"/>
-          <w:color w:val="1a1a2e"/>
-          <w:sz w:val="23"/>
-          <w:szCs w:val="23"/>
-          <w:rtl w:val="0"/>
-        </w:rPr>
-        <w:t xml:space="preserve">Junior Frontend Developer </w:t>
-      </w:r>
-      <w:r>
-        <w:rPr>
-          <w:rFonts w:ascii="Calibri" w:cs="Calibri" w:eastAsia="Calibri" w:hAnsi="Calibri"/>
-          <w:b w:val="1"/>
-          <w:bCs w:val="1"/>
-          <w:color w:val="1a1a2e"/>
-          <w:sz w:val="23"/>
-          <w:szCs w:val="23"/>
-          <w:rtl w:val="0"/>
-        </w:rPr>
-        <w:t xml:space="preserve"> ·  OldminTeam — Zhytomyr</w:t>
-      </w:r>
-      <w:r>
-        <w:rPr>
-          <w:rtl w:val="0"/>
-        </w:rPr>
-      </w:r>
-    </w:p>
-    <w:p>
-      <w:pPr>
-        <w:spacing w:after="40" w:before="0" w:lineRule="auto"/>
-        <w:rPr>
-          <w:sz w:val="22"/>
-          <w:szCs w:val="22"/>
-        </w:rPr>
-      </w:pPr>
-      <w:r>
-        <w:rPr>
-          <w:rFonts w:ascii="Calibri" w:cs="Calibri" w:eastAsia="Calibri" w:hAnsi="Calibri"/>
-          <w:i w:val="1"/>
-          <w:iCs w:val="1"/>
-          <w:color w:val="555566"/>
-          <w:rtl w:val="0"/>
-        </w:rPr>
-        <w:t xml:space="preserve">May 2018 – April 2019</w:t>
-      </w:r>
-      <w:r>
-        <w:rPr>
-          <w:rtl w:val="0"/>
-        </w:rPr>
-      </w:r>
-    </w:p>
-    <w:p>
-      <w:pPr>
-        <w:keepNext w:val="0"/>
-        <w:keepLines w:val="0"/>
-        <w:pageBreakBefore w:val="0"/>
-        <w:widowControl w:val="1"/>
-        <w:numPr>
-          <w:ilvl w:val="0"/>
-          <w:numId w:val="1"/>
-        </w:numPr>
-        <w:pBdr>
-          <w:top w:space="0" w:sz="0" w:val="nil"/>
-          <w:left w:space="0" w:sz="0" w:val="nil"/>
-          <w:bottom w:space="0" w:sz="0" w:val="nil"/>
-          <w:right w:space="0" w:sz="0" w:val="nil"/>
-          <w:between w:space="0" w:sz="0" w:val="nil"/>
-        </w:pBdr>
-        <w:shd w:fill="auto" w:val="clear"/>
-        <w:spacing w:after="20" w:before="20" w:line="276" w:lineRule="auto"/>
-        <w:ind w:left="283" w:right="0" w:hanging="360"/>
-        <w:jc w:val="left"/>
-        <w:rPr>
-          <w:sz w:val="22"/>
-          <w:szCs w:val="22"/>
-        </w:rPr>
-      </w:pPr>
-      <w:r>
-        <w:rPr>
-          <w:rFonts w:ascii="Calibri" w:cs="Calibri" w:eastAsia="Calibri" w:hAnsi="Calibri"/>
-          <w:b w:val="0"/>
-          <w:bCs w:val="0"/>
-          <w:i w:val="0"/>
-          <w:iCs w:val="0"/>
-          <w:smallCaps w:val="0"/>
-          <w:strike w:val="0"/>
-          <w:color w:val="1a1a2e"/>
-          <w:sz w:val="21"/>
-          <w:szCs w:val="21"/>
-          <w:u w:val="none"/>
-          <w:shd w:fill="auto" w:val="clear"/>
-          <w:vertAlign w:val="baseline"/>
-          <w:rtl w:val="0"/>
-        </w:rPr>
-        <w:t xml:space="preserve">Cross-platform web and mobile applications with Angular 2+, React.js, React Native.</w:t>
-      </w:r>
-      <w:r>
-        <w:rPr>
-          <w:rtl w:val="0"/>
-        </w:rPr>
-      </w:r>
-    </w:p>
-    <w:p>
-      <w:pPr>
-        <w:spacing w:after="20" w:before="100" w:lineRule="auto"/>
-        <w:rPr>
-          <w:sz w:val="22"/>
-          <w:szCs w:val="22"/>
-        </w:rPr>
-      </w:pPr>
-      <w:r>
-        <w:rPr>
-          <w:b w:val="1"/>
-          <w:bCs w:val="1"/>
-          <w:color w:val="1a1a2e"/>
-          <w:sz w:val="23"/>
-          <w:szCs w:val="23"/>
-          <w:rtl w:val="0"/>
-        </w:rPr>
-        <w:t xml:space="preserve">Junior Frontend</w:t>
-      </w:r>
-      <w:r>
-        <w:rPr>
-          <w:rFonts w:ascii="Calibri" w:cs="Calibri" w:eastAsia="Calibri" w:hAnsi="Calibri"/>
-          <w:b w:val="1"/>
-          <w:bCs w:val="1"/>
-          <w:color w:val="1a1a2e"/>
-          <w:sz w:val="23"/>
-          <w:szCs w:val="23"/>
-          <w:rtl w:val="0"/>
-        </w:rPr>
-        <w:t xml:space="preserve"> Developer  ·  JBS Ukraine — Zhytomyr</w:t>
-      </w:r>
-      <w:r>
-        <w:rPr>
-          <w:rtl w:val="0"/>
-        </w:rPr>
-      </w:r>
-    </w:p>
-    <w:p>
-      <w:pPr>
-        <w:spacing w:after="40" w:before="0" w:lineRule="auto"/>
-        <w:rPr>
-          <w:sz w:val="22"/>
-          <w:szCs w:val="22"/>
-        </w:rPr>
-      </w:pPr>
-      <w:r>
-        <w:rPr>
-          <w:rFonts w:ascii="Calibri" w:cs="Calibri" w:eastAsia="Calibri" w:hAnsi="Calibri"/>
-          <w:i w:val="1"/>
-          <w:iCs w:val="1"/>
-          <w:color w:val="555566"/>
-          <w:rtl w:val="0"/>
-        </w:rPr>
-        <w:t xml:space="preserve">May 2016 – May 2018</w:t>
-      </w:r>
-      <w:r>
-        <w:rPr>
-          <w:rtl w:val="0"/>
-        </w:rPr>
-      </w:r>
-    </w:p>
-    <w:p>
-      <w:pPr>
-        <w:keepNext w:val="0"/>
-        <w:keepLines w:val="0"/>
-        <w:pageBreakBefore w:val="0"/>
-        <w:widowControl w:val="1"/>
-        <w:numPr>
-          <w:ilvl w:val="0"/>
-          <w:numId w:val="1"/>
-        </w:numPr>
-        <w:pBdr>
-          <w:top w:space="0" w:sz="0" w:val="nil"/>
-          <w:left w:space="0" w:sz="0" w:val="nil"/>
-          <w:bottom w:space="0" w:sz="0" w:val="nil"/>
-          <w:right w:space="0" w:sz="0" w:val="nil"/>
-          <w:between w:space="0" w:sz="0" w:val="nil"/>
-        </w:pBdr>
-        <w:shd w:fill="auto" w:val="clear"/>
-        <w:spacing w:after="20" w:before="20" w:line="276" w:lineRule="auto"/>
-        <w:ind w:left="283" w:right="0" w:hanging="360"/>
-        <w:jc w:val="left"/>
-        <w:rPr>
-          <w:sz w:val="22"/>
-          <w:szCs w:val="22"/>
-        </w:rPr>
-      </w:pPr>
-      <w:r>
-        <w:rPr>
-          <w:rFonts w:ascii="Calibri" w:cs="Calibri" w:eastAsia="Calibri" w:hAnsi="Calibri"/>
-          <w:b w:val="0"/>
-          <w:bCs w:val="0"/>
-          <w:i w:val="0"/>
-          <w:iCs w:val="0"/>
-          <w:smallCaps w:val="0"/>
-          <w:strike w:val="0"/>
-          <w:color w:val="1a1a2e"/>
-          <w:sz w:val="21"/>
-          <w:szCs w:val="21"/>
-          <w:u w:val="none"/>
-          <w:shd w:fill="auto" w:val="clear"/>
-          <w:vertAlign w:val="baseline"/>
-          <w:rtl w:val="0"/>
-        </w:rPr>
-        <w:t xml:space="preserve">Responsive layouts, corporate web platforms, third-party REST API integrations.</w:t>
-      </w:r>
-      <w:r>
-        <w:rPr>
-          <w:rtl w:val="0"/>
-        </w:rPr>
-      </w:r>
-    </w:p>
-    <w:p>
-      <w:pPr>
-        <w:spacing w:after="60" w:before="120" w:lineRule="auto"/>
-        <w:rPr/>
-      </w:pPr>
-      <w:r>
-        <w:rPr>
-          <w:rtl w:val="0"/>
-        </w:rPr>
-      </w:r>
-    </w:p>
-    <w:p>
-      <w:pPr>
-        <w:spacing w:after="60" w:before="120" w:lineRule="auto"/>
-        <w:rPr/>
-      </w:pPr>
-      <w:r>
-        <w:rPr>
-          <w:rtl w:val="0"/>
-        </w:rPr>
-      </w:r>
-    </w:p>
-    <w:p>
-      <w:pPr>
-        <w:spacing w:after="60" w:before="120" w:lineRule="auto"/>
-        <w:rPr/>
-      </w:pPr>
-      <w:r>
-        <w:rPr>
-          <w:rtl w:val="0"/>
-        </w:rPr>
-      </w:r>
-    </w:p>
-    <w:p>
-      <w:pPr>
-        <w:spacing w:after="60" w:before="120" w:lineRule="auto"/>
-        <w:rPr>
-          <w:sz w:val="22"/>
-          <w:szCs w:val="22"/>
-        </w:rPr>
-      </w:pPr>
-      <w:r>
-        <w:rPr>
-          <w:rFonts w:ascii="Calibri" w:cs="Calibri" w:eastAsia="Calibri" w:hAnsi="Calibri"/>
-          <w:b w:val="1"/>
-          <w:bCs w:val="1"/>
-          <w:color w:val="1a73e8"/>
-          <w:sz w:val="22"/>
-          <w:szCs w:val="22"/>
-          <w:rtl w:val="0"/>
-        </w:rPr>
-        <w:t xml:space="preserve">TECHNICAL SKILLS</w:t>
-      </w:r>
-      <w:r>
-        <w:rPr>
-          <w:rtl w:val="0"/>
-        </w:rPr>
-      </w:r>
-    </w:p>
-    <w:p>
-      <w:pPr>
-        <w:spacing w:after="40" w:before="40" w:lineRule="auto"/>
-        <w:rPr>
-          <w:sz w:val="22"/>
-          <w:szCs w:val="22"/>
-        </w:rPr>
-      </w:pPr>
-      <w:r>
-        <w:rPr>
-          <w:rFonts w:ascii="Calibri" w:cs="Calibri" w:eastAsia="Calibri" w:hAnsi="Calibri"/>
-          <w:b w:val="1"/>
-          <w:bCs w:val="1"/>
-          <w:color w:val="1a1a2e"/>
-          <w:sz w:val="21"/>
-          <w:szCs w:val="21"/>
-          <w:rtl w:val="0"/>
-        </w:rPr>
-        <w:t xml:space="preserve">Languages: </w:t>
-      </w:r>
-      <w:r>
-        <w:rPr>
-          <w:rFonts w:ascii="Calibri" w:cs="Calibri" w:eastAsia="Calibri" w:hAnsi="Calibri"/>
-          <w:color w:val="555566"/>
-          <w:sz w:val="21"/>
-          <w:szCs w:val="21"/>
-          <w:rtl w:val="0"/>
-        </w:rPr>
-        <w:t xml:space="preserve">JavaScript (ES6+), TypeScript, HTML5, CSS3</w:t>
-      </w:r>
-      <w:r>
-        <w:rPr>
-          <w:rtl w:val="0"/>
-        </w:rPr>
-      </w:r>
-    </w:p>
-    <w:p>
-      <w:pPr>
-        <w:spacing w:after="40" w:before="40" w:lineRule="auto"/>
-        <w:rPr>
-          <w:sz w:val="22"/>
-          <w:szCs w:val="22"/>
-        </w:rPr>
-      </w:pPr>
-      <w:r>
-        <w:rPr>
-          <w:rFonts w:ascii="Calibri" w:cs="Calibri" w:eastAsia="Calibri" w:hAnsi="Calibri"/>
-          <w:b w:val="1"/>
-          <w:bCs w:val="1"/>
-          <w:color w:val="1a1a2e"/>
-          <w:sz w:val="21"/>
-          <w:szCs w:val="21"/>
-          <w:rtl w:val="0"/>
-        </w:rPr>
-        <w:t xml:space="preserve">Frameworks &amp; Libs: </w:t>
-      </w:r>
-      <w:r>
-        <w:rPr>
-          <w:rFonts w:ascii="Calibri" w:cs="Calibri" w:eastAsia="Calibri" w:hAnsi="Calibri"/>
-          <w:color w:val="555566"/>
-          <w:sz w:val="21"/>
-          <w:szCs w:val="21"/>
-          <w:rtl w:val="0"/>
-        </w:rPr>
-        <w:t xml:space="preserve">React, Next.js, Angular (2+), React Native, Redux, React Context</w:t>
-      </w:r>
-      <w:r>
-        <w:rPr>
-          <w:rtl w:val="0"/>
-        </w:rPr>
-      </w:r>
-    </w:p>
-    <w:p>
-      <w:pPr>
-        <w:spacing w:after="40" w:before="40" w:lineRule="auto"/>
-        <w:rPr>
-          <w:sz w:val="22"/>
-          <w:szCs w:val="22"/>
-        </w:rPr>
-      </w:pPr>
-      <w:r>
-        <w:rPr>
-          <w:rFonts w:ascii="Calibri" w:cs="Calibri" w:eastAsia="Calibri" w:hAnsi="Calibri"/>
-          <w:b w:val="1"/>
-          <w:bCs w:val="1"/>
-          <w:color w:val="1a1a2e"/>
-          <w:sz w:val="21"/>
-          <w:szCs w:val="21"/>
-          <w:rtl w:val="0"/>
-        </w:rPr>
-        <w:t xml:space="preserve">Forms &amp; Validation: </w:t>
-      </w:r>
-      <w:r>
-        <w:rPr>
-          <w:rFonts w:ascii="Calibri" w:cs="Calibri" w:eastAsia="Calibri" w:hAnsi="Calibri"/>
-          <w:color w:val="555566"/>
-          <w:sz w:val="21"/>
-          <w:szCs w:val="21"/>
-          <w:rtl w:val="0"/>
-        </w:rPr>
-        <w:t xml:space="preserve">Final Form, React Hook Form, Formik, Redux Form, </w:t>
-      </w:r>
-      <w:r>
-        <w:rPr>
-          <w:color w:val="555566"/>
-          <w:sz w:val="21"/>
-          <w:szCs w:val="21"/>
-          <w:rtl w:val="0"/>
-        </w:rPr>
-        <w:t xml:space="preserve">TanStack Query</w:t>
-      </w:r>
-      <w:r>
-        <w:rPr>
-          <w:rtl w:val="0"/>
-        </w:rPr>
-      </w:r>
-    </w:p>
-    <w:p>
-      <w:pPr>
-        <w:spacing w:after="40" w:before="40" w:lineRule="auto"/>
-        <w:rPr>
-          <w:sz w:val="22"/>
-          <w:szCs w:val="22"/>
-        </w:rPr>
-      </w:pPr>
-      <w:r>
-        <w:rPr>
-          <w:rFonts w:ascii="Calibri" w:cs="Calibri" w:eastAsia="Calibri" w:hAnsi="Calibri"/>
-          <w:b w:val="1"/>
-          <w:bCs w:val="1"/>
-          <w:color w:val="1a1a2e"/>
-          <w:sz w:val="21"/>
-          <w:szCs w:val="21"/>
-          <w:rtl w:val="0"/>
-        </w:rPr>
-        <w:t xml:space="preserve">Styling &amp; UI: </w:t>
-      </w:r>
-      <w:r>
-        <w:rPr>
-          <w:rFonts w:ascii="Calibri" w:cs="Calibri" w:eastAsia="Calibri" w:hAnsi="Calibri"/>
-          <w:color w:val="555566"/>
-          <w:sz w:val="21"/>
-          <w:szCs w:val="21"/>
-          <w:rtl w:val="0"/>
-        </w:rPr>
-        <w:t xml:space="preserve">Sass, Styled Components, CSS Modules, UIKit, Material UI, Design Systems</w:t>
-      </w:r>
-      <w:r>
-        <w:rPr>
-          <w:rtl w:val="0"/>
-        </w:rPr>
-      </w:r>
-    </w:p>
-    <w:p>
-      <w:pPr>
-        <w:spacing w:after="40" w:before="40" w:lineRule="auto"/>
-        <w:rPr>
-          <w:sz w:val="22"/>
-          <w:szCs w:val="22"/>
-        </w:rPr>
-      </w:pPr>
-      <w:r>
-        <w:rPr>
-          <w:rFonts w:ascii="Calibri" w:cs="Calibri" w:eastAsia="Calibri" w:hAnsi="Calibri"/>
-          <w:b w:val="1"/>
-          <w:bCs w:val="1"/>
-          <w:color w:val="1a1a2e"/>
-          <w:sz w:val="21"/>
-          <w:szCs w:val="21"/>
-          <w:rtl w:val="0"/>
-        </w:rPr>
-        <w:t xml:space="preserve">Testing: </w:t>
-      </w:r>
-      <w:r>
-        <w:rPr>
-          <w:rFonts w:ascii="Calibri" w:cs="Calibri" w:eastAsia="Calibri" w:hAnsi="Calibri"/>
-          <w:color w:val="555566"/>
-          <w:sz w:val="21"/>
-          <w:szCs w:val="21"/>
-          <w:rtl w:val="0"/>
-        </w:rPr>
-        <w:t xml:space="preserve">Playwright, Jest, Vitest</w:t>
-      </w:r>
-      <w:r>
-        <w:rPr>
-          <w:rtl w:val="0"/>
-        </w:rPr>
-      </w:r>
-    </w:p>
-    <w:p>
-      <w:pPr>
-        <w:spacing w:after="40" w:before="40" w:lineRule="auto"/>
-        <w:rPr>
-          <w:sz w:val="22"/>
-          <w:szCs w:val="22"/>
-        </w:rPr>
-      </w:pPr>
-      <w:r>
-        <w:rPr>
-          <w:rFonts w:ascii="Calibri" w:cs="Calibri" w:eastAsia="Calibri" w:hAnsi="Calibri"/>
-          <w:b w:val="1"/>
-          <w:bCs w:val="1"/>
-          <w:color w:val="1a1a2e"/>
-          <w:sz w:val="21"/>
-          <w:szCs w:val="21"/>
-          <w:rtl w:val="0"/>
-        </w:rPr>
-        <w:t xml:space="preserve">Tools: </w:t>
-      </w:r>
-      <w:r>
-        <w:rPr>
-          <w:rFonts w:ascii="Calibri" w:cs="Calibri" w:eastAsia="Calibri" w:hAnsi="Calibri"/>
-          <w:color w:val="555566"/>
-          <w:sz w:val="21"/>
-          <w:szCs w:val="21"/>
-          <w:rtl w:val="0"/>
-        </w:rPr>
-        <w:t xml:space="preserve">Git, Figma, Storybook, Sentry monitoring</w:t>
-      </w:r>
-      <w:r>
-        <w:rPr>
-          <w:rtl w:val="0"/>
-        </w:rPr>
-      </w:r>
-    </w:p>
-    <w:p>
-      <w:pPr>
-        <w:pBdr>
-          <w:bottom w:color="ccd6f0" w:space="1" w:sz="4" w:val="single"/>
-        </w:pBdr>
-        <w:spacing w:after="80" w:before="40" w:lineRule="auto"/>
-        <w:rPr>
-          <w:sz w:val="22"/>
-          <w:szCs w:val="22"/>
-        </w:rPr>
-      </w:pPr>
-      <w:r>
-        <w:rPr>
-          <w:rtl w:val="0"/>
-        </w:rPr>
-      </w:r>
-    </w:p>
-    <w:p>
-      <w:pPr>
-        <w:spacing w:after="60" w:before="120" w:lineRule="auto"/>
-        <w:rPr>
-          <w:b w:val="1"/>
-          <w:bCs w:val="1"/>
-          <w:color w:val="1a73e8"/>
-          <w:sz w:val="22"/>
-          <w:szCs w:val="22"/>
-        </w:rPr>
-      </w:pPr>
-      <w:r>
-        <w:rPr>
-          <w:rtl w:val="0"/>
-        </w:rPr>
-      </w:r>
-    </w:p>
-    <w:p>
-      <w:pPr>
-        <w:spacing w:after="60" w:before="120" w:lineRule="auto"/>
-        <w:rPr>
-          <w:sz w:val="22"/>
-          <w:szCs w:val="22"/>
-        </w:rPr>
-      </w:pPr>
-      <w:r>
-        <w:rPr>
-          <w:rFonts w:ascii="Calibri" w:cs="Calibri" w:eastAsia="Calibri" w:hAnsi="Calibri"/>
-          <w:b w:val="1"/>
-          <w:bCs w:val="1"/>
-          <w:color w:val="1a73e8"/>
-          <w:sz w:val="22"/>
-          <w:szCs w:val="22"/>
-          <w:rtl w:val="0"/>
-        </w:rPr>
-        <w:t xml:space="preserve">ACHIEVEMENTS</w:t>
-      </w:r>
-      <w:r>
-        <w:rPr>
-          <w:rtl w:val="0"/>
-        </w:rPr>
-      </w:r>
-    </w:p>
-    <w:p>
-      <w:pPr>
-        <w:keepNext w:val="0"/>
-        <w:keepLines w:val="0"/>
-        <w:pageBreakBefore w:val="0"/>
-        <w:widowControl w:val="1"/>
-        <w:numPr>
-          <w:ilvl w:val="0"/>
-          <w:numId w:val="1"/>
-        </w:numPr>
-        <w:pBdr>
-          <w:top w:space="0" w:sz="0" w:val="nil"/>
-          <w:left w:space="0" w:sz="0" w:val="nil"/>
-          <w:bottom w:space="0" w:sz="0" w:val="nil"/>
-          <w:right w:space="0" w:sz="0" w:val="nil"/>
-          <w:between w:space="0" w:sz="0" w:val="nil"/>
-        </w:pBdr>
-        <w:shd w:fill="auto" w:val="clear"/>
-        <w:spacing w:after="0" w:before="20" w:line="276" w:lineRule="auto"/>
-        <w:ind w:left="283" w:right="0" w:hanging="360"/>
-        <w:jc w:val="left"/>
-        <w:rPr>
-          <w:sz w:val="22"/>
-          <w:szCs w:val="22"/>
-        </w:rPr>
-      </w:pPr>
-      <w:r>
-        <w:rPr>
-          <w:color w:val="1a1a2e"/>
-          <w:sz w:val="21"/>
-          <w:szCs w:val="21"/>
-          <w:rtl w:val="0"/>
-        </w:rPr>
-        <w:t xml:space="preserve">Transformed the free functionality of the application into a multi-level subscription, which allowed us to attract 150+ premium subscribers and increase monthly revenue from subscriptions.</w:t>
+        <w:t xml:space="preserve">Built high-performance tables and complex data-entry forms for reliable real-time market data ingestion.</w:t>
       </w:r>
       <w:r>
         <w:rPr>
@@ -1561,22 +1689,12 @@
       </w:pPr>
       <w:r>
         <w:rPr>
-          <w:rFonts w:ascii="Calibri" w:cs="Calibri" w:eastAsia="Calibri" w:hAnsi="Calibri"/>
-          <w:b w:val="0"/>
-          <w:bCs w:val="0"/>
-          <w:i w:val="0"/>
-          <w:iCs w:val="0"/>
-          <w:smallCaps w:val="0"/>
-          <w:strike w:val="0"/>
-          <w:color w:val="1a1a2e"/>
-          <w:sz w:val="21"/>
-          <w:szCs w:val="21"/>
-          <w:u w:val="none"/>
-          <w:shd w:fill="auto" w:val="clear"/>
-          <w:vertAlign w:val="baseline"/>
-          <w:rtl w:val="0"/>
-        </w:rPr>
-        <w:t xml:space="preserve">Built high-performance tables and complex data-entry forms for reliable real-time market data ingestion.</w:t>
+          <w:color w:val="1a1a2e"/>
+          <w:sz w:val="21"/>
+          <w:szCs w:val="21"/>
+          <w:rtl w:val="0"/>
+        </w:rPr>
+        <w:t xml:space="preserve">Test suite from scratch: 50+ Playwright E2E + Jest/Vitest unit tests in GitHub Actions CI → continuous regression detection on every PR.</w:t>
       </w:r>
       <w:r>
         <w:rPr>
@@ -1627,7 +1745,7 @@
           <w:vertAlign w:val="baseline"/>
           <w:rtl w:val="0"/>
         </w:rPr>
-        <w:t xml:space="preserve">Contributed to e2e testing with Playwright and unit/functional suites (Jest, Vitest), improving release stability.</w:t>
+        <w:t xml:space="preserve">Optimized client-side components for the high-traffic Favbet platform under heavy load.</w:t>
       </w:r>
       <w:r>
         <w:rPr>
@@ -1663,73 +1781,12 @@
       </w:pPr>
       <w:r>
         <w:rPr>
-          <w:rFonts w:ascii="Calibri" w:cs="Calibri" w:eastAsia="Calibri" w:hAnsi="Calibri"/>
-          <w:b w:val="0"/>
-          <w:bCs w:val="0"/>
-          <w:i w:val="0"/>
-          <w:iCs w:val="0"/>
-          <w:smallCaps w:val="0"/>
-          <w:strike w:val="0"/>
-          <w:color w:val="1a1a2e"/>
-          <w:sz w:val="21"/>
-          <w:szCs w:val="21"/>
-          <w:u w:val="none"/>
-          <w:shd w:fill="auto" w:val="clear"/>
-          <w:vertAlign w:val="baseline"/>
-          <w:rtl w:val="0"/>
-        </w:rPr>
-        <w:t xml:space="preserve">Optimized client-side components for the high-traffic Favbet platform under heavy load.</w:t>
-      </w:r>
-      <w:r>
-        <w:rPr>
-          <w:rtl w:val="0"/>
-        </w:rPr>
-      </w:r>
-    </w:p>
-    <w:p>
-      <w:pPr>
-        <w:keepNext w:val="0"/>
-        <w:keepLines w:val="0"/>
-        <w:pageBreakBefore w:val="0"/>
-        <w:widowControl w:val="1"/>
-        <w:numPr>
-          <w:ilvl w:val="0"/>
-          <w:numId w:val="1"/>
-        </w:numPr>
-        <w:pBdr>
-          <w:top w:space="0" w:sz="0" w:val="nil"/>
-          <w:left w:space="0" w:sz="0" w:val="nil"/>
-          <w:bottom w:space="0" w:sz="0" w:val="nil"/>
-          <w:right w:space="0" w:sz="0" w:val="nil"/>
-          <w:between w:space="0" w:sz="0" w:val="nil"/>
-        </w:pBdr>
-        <w:shd w:fill="auto" w:val="clear"/>
-        <w:spacing w:after="20" w:before="0" w:line="276" w:lineRule="auto"/>
-        <w:ind w:left="283" w:right="0" w:hanging="360"/>
-        <w:jc w:val="left"/>
-        <w:rPr>
-          <w:sz w:val="22"/>
-          <w:szCs w:val="22"/>
-        </w:rPr>
-      </w:pPr>
-      <w:r>
-        <w:rPr>
-          <w:rFonts w:ascii="Calibri" w:cs="Calibri" w:eastAsia="Calibri" w:hAnsi="Calibri"/>
-          <w:b w:val="0"/>
-          <w:bCs w:val="0"/>
-          <w:i w:val="0"/>
-          <w:iCs w:val="0"/>
-          <w:smallCaps w:val="0"/>
-          <w:strike w:val="0"/>
-          <w:color w:val="1a1a2e"/>
-          <w:sz w:val="21"/>
-          <w:szCs w:val="21"/>
-          <w:u w:val="none"/>
-          <w:shd w:fill="auto" w:val="clear"/>
-          <w:vertAlign w:val="baseline"/>
-          <w:rtl w:val="0"/>
-        </w:rPr>
-        <w:t xml:space="preserve">Designed reusable UI components and custom React Hooks, reducing code duplication.</w:t>
+          <w:color w:val="1a1a2e"/>
+          <w:sz w:val="21"/>
+          <w:szCs w:val="21"/>
+          <w:rtl w:val="0"/>
+        </w:rPr>
+        <w:t xml:space="preserve">Reusable component systems: Designed custom React Hooks and UI component libraries across multiple projects (Betinvest, Softwarium) → reduced duplication and accelerated feature delivery.</w:t>
       </w:r>
       <w:r>
         <w:rPr>
@@ -2049,7 +2106,7 @@
           <w:szCs w:val="22"/>
           <w:rtl w:val="0"/>
         </w:rPr>
-        <w:t xml:space="preserve">SERTIFICATIONS</w:t>
+        <w:t xml:space="preserve">CERTIFICATIONS</w:t>
       </w:r>
       <w:r>
         <w:rPr>

</xml_diff>

<commit_message>
React performance course certificate added
</commit_message>
<xml_diff>
--- a/CV_Osnadchuk_V_O.docx
+++ b/CV_Osnadchuk_V_O.docx
@@ -2118,24 +2118,104 @@
       <w:pPr>
         <w:spacing w:after="40" w:before="40" w:lineRule="auto"/>
         <w:rPr>
-          <w:rFonts w:ascii="Calibri" w:cs="Calibri" w:eastAsia="Calibri" w:hAnsi="Calibri"/>
+          <w:color w:val="1a1a2e"/>
+          <w:sz w:val="21"/>
+          <w:szCs w:val="21"/>
+        </w:rPr>
+      </w:pPr>
+      <w:r>
+        <w:rPr>
+          <w:b w:val="1"/>
+          <w:bCs w:val="1"/>
+          <w:color w:val="1a1a2e"/>
+          <w:sz w:val="21"/>
+          <w:szCs w:val="21"/>
+          <w:rtl w:val="0"/>
+        </w:rPr>
+        <w:t xml:space="preserve">Next.js Fundamentals, v4 Course Completed </w:t>
+      </w:r>
+      <w:r>
+        <w:rPr>
           <w:color w:val="555566"/>
-        </w:rPr>
-      </w:pPr>
-      <w:r>
-        <w:rPr>
-          <w:b w:val="1"/>
-          <w:bCs w:val="1"/>
-          <w:color w:val="1a1a2e"/>
-          <w:sz w:val="21"/>
-          <w:szCs w:val="21"/>
-          <w:rtl w:val="0"/>
-        </w:rPr>
-        <w:t xml:space="preserve">Next.js Fundamentals, v4 Course Completed </w:t>
+          <w:sz w:val="21"/>
+          <w:szCs w:val="21"/>
+          <w:rtl w:val="0"/>
+        </w:rPr>
+        <w:t xml:space="preserve">—</w:t>
+      </w:r>
+      <w:r>
+        <w:rPr>
+          <w:b w:val="1"/>
+          <w:bCs w:val="1"/>
+          <w:color w:val="1a1a2e"/>
+          <w:sz w:val="21"/>
+          <w:szCs w:val="21"/>
+          <w:rtl w:val="0"/>
+        </w:rPr>
+        <w:t xml:space="preserve"> </w:t>
       </w:r>
       <w:r>
         <w:rPr>
           <w:color w:val="555566"/>
+          <w:rtl w:val="0"/>
+        </w:rPr>
+        <w:t xml:space="preserve">Issued Sep 2026 </w:t>
+      </w:r>
+      <w:r>
+        <w:rPr>
+          <w:b w:val="1"/>
+          <w:bCs w:val="1"/>
+          <w:color w:val="1a1a2e"/>
+          <w:sz w:val="21"/>
+          <w:szCs w:val="21"/>
+          <w:rtl w:val="0"/>
+        </w:rPr>
+        <w:br w:type="textWrapping"/>
+      </w:r>
+      <w:r>
+        <w:rPr>
+          <w:color w:val="1a1a2e"/>
+          <w:sz w:val="21"/>
+          <w:szCs w:val="21"/>
+          <w:rtl w:val="0"/>
+        </w:rPr>
+        <w:t xml:space="preserve">Master.dev (Formerly Frontend Masters)</w:t>
+      </w:r>
+    </w:p>
+    <w:p>
+      <w:pPr>
+        <w:spacing w:after="40" w:before="40" w:lineRule="auto"/>
+        <w:rPr>
+          <w:rFonts w:ascii="Roboto" w:cs="Roboto" w:eastAsia="Roboto" w:hAnsi="Roboto"/>
+          <w:color w:val="1a1a2e"/>
+          <w:sz w:val="21"/>
+          <w:szCs w:val="21"/>
+        </w:rPr>
+      </w:pPr>
+      <w:r>
+        <w:rPr>
+          <w:b w:val="1"/>
+          <w:bCs w:val="1"/>
+          <w:color w:val="1a1a2e"/>
+          <w:sz w:val="21"/>
+          <w:szCs w:val="21"/>
+          <w:rtl w:val="0"/>
+        </w:rPr>
+        <w:t xml:space="preserve">React Performance, v2 Course Completed</w:t>
+      </w:r>
+      <w:r>
+        <w:rPr>
+          <w:rFonts w:ascii="Roboto" w:cs="Roboto" w:eastAsia="Roboto" w:hAnsi="Roboto"/>
+          <w:color w:val="1a1a2e"/>
+          <w:sz w:val="24"/>
+          <w:szCs w:val="24"/>
+          <w:rtl w:val="0"/>
+        </w:rPr>
+        <w:t xml:space="preserve"> </w:t>
+      </w:r>
+      <w:r>
+        <w:rPr>
+          <w:color w:val="555566"/>
           <w:sz w:val="21"/>
           <w:szCs w:val="21"/>
           <w:rtl w:val="0"/>
@@ -2144,11 +2224,10 @@
       </w:r>
       <w:r>
         <w:rPr>
-          <w:b w:val="1"/>
-          <w:bCs w:val="1"/>
-          <w:color w:val="1a1a2e"/>
-          <w:sz w:val="21"/>
-          <w:szCs w:val="21"/>
+          <w:rFonts w:ascii="Roboto" w:cs="Roboto" w:eastAsia="Roboto" w:hAnsi="Roboto"/>
+          <w:color w:val="1a1a2e"/>
+          <w:sz w:val="24"/>
+          <w:szCs w:val="24"/>
           <w:rtl w:val="0"/>
         </w:rPr>
         <w:t xml:space="preserve"> </w:t>
@@ -2158,19 +2237,24 @@
           <w:color w:val="555566"/>
           <w:rtl w:val="0"/>
         </w:rPr>
-        <w:t xml:space="preserve">Issued Sep 2026 </w:t>
-      </w:r>
-      <w:r>
-        <w:rPr>
-          <w:b w:val="1"/>
-          <w:bCs w:val="1"/>
-          <w:color w:val="1a1a2e"/>
-          <w:sz w:val="21"/>
-          <w:szCs w:val="21"/>
-          <w:rtl w:val="0"/>
-        </w:rPr>
-        <w:br w:type="textWrapping"/>
-      </w:r>
+        <w:t xml:space="preserve">Issued Jan 2026</w:t>
+      </w:r>
+      <w:r>
+        <w:rPr>
+          <w:rtl w:val="0"/>
+        </w:rPr>
+      </w:r>
+    </w:p>
+    <w:p>
+      <w:pPr>
+        <w:spacing w:after="40" w:before="40" w:lineRule="auto"/>
+        <w:rPr>
+          <w:rFonts w:ascii="Roboto" w:cs="Roboto" w:eastAsia="Roboto" w:hAnsi="Roboto"/>
+          <w:color w:val="1a1a2e"/>
+          <w:sz w:val="21"/>
+          <w:szCs w:val="21"/>
+        </w:rPr>
+      </w:pPr>
       <w:r>
         <w:rPr>
           <w:color w:val="1a1a2e"/>

</xml_diff>